<commit_message>
updating the figures to be more readable
</commit_message>
<xml_diff>
--- a/03_manuscript/manuscript.docx
+++ b/03_manuscript/manuscript.docx
@@ -33,7 +33,7 @@
         <w:t xml:space="preserve">2</w:t>
       </w:r>
       <w:r>
-        <w:t xml:space="preserve">, John Edlund</w:t>
+        <w:t xml:space="preserve">, John E. Edlund</w:t>
       </w:r>
       <w:r>
         <w:rPr>
@@ -65,7 +65,7 @@
         <w:t xml:space="preserve"> </w:t>
       </w:r>
       <w:r>
-        <w:t xml:space="preserve">Michigan Virtual</w:t>
+        <w:t xml:space="preserve">Independent Researcher</w:t>
       </w:r>
     </w:p>
     <w:p>
@@ -156,7 +156,7 @@
         <w:pStyle w:val="authornote"/>
       </w:pPr>
       <w:r>
-        <w:t xml:space="preserve">The authors made the following contributions. Kelly Cuccolo: Conceptualization, Writing - Original Draft Preparation, Writing - Review &amp; Editing; Jordan Wagge: Conceptualization, Writing - Original Draft Preparation, Writing - Review &amp; Editing; John Edlund: Conceptualization, Writing - Original Draft Preparation, Writing - Review &amp; Editing; Erin M. Buchanan: Conceptualization, Writing - Original Draft Preparation, Writing - Review &amp; Editing, Analysis, Visualization.</w:t>
+        <w:t xml:space="preserve">The authors made the following contributions. Kelly Cuccolo: Conceptualization, Writing - Original Draft Preparation, Writing - Review &amp; Editing; Jordan Wagge: Conceptualization, Writing - Original Draft Preparation, Writing - Review &amp; Editing; John E. Edlund: Conceptualization, Writing - Original Draft Preparation, Writing - Review &amp; Editing; Erin M. Buchanan: Conceptualization, Writing - Original Draft Preparation, Writing - Review &amp; Editing, Analysis, Visualization.</w:t>
       </w:r>
     </w:p>
     <w:p>
@@ -191,7 +191,7 @@
         <w:pStyle w:val="Textkrper"/>
       </w:pPr>
       <w:r>
-        <w:t xml:space="preserve">Specific disciplines have reported recent increases in scientific collaboration (i.e., co-authorship), which may be related to article metric benefits (i.e., increased citation rates). However, it is currently unclear what disciplines have seen increases in collaboration, and if this increase in collaboration is associated with increased citation rates. Additionally, little is known about how demographic characteristics of the authorship team (e.g.,</w:t>
+        <w:t xml:space="preserve">Scientific collaboration, often measured through co-authorship, has grown in many disciplines and is frequently linked to increased citation rates. However, it remains unclear which disciplines have seen the greatest growth in collaboration and how this growth relates to article-level metrics. Moreover, little is known about how team demographics (e.g.,</w:t>
       </w:r>
       <w:r>
         <w:t xml:space="preserve"> </w:t>
@@ -204,7 +204,20 @@
         <w:t xml:space="preserve">h</w:t>
       </w:r>
       <w:r>
-        <w:t xml:space="preserve">-index, gender, number of participating institutions) may influence article metrics in tandem with team size. Understanding the impact of collaboration patterns across time and on article metrics is critical given the importance of these factors in hiring and tenure decisions, and the general growth of the scientific enterprise. We used metadata provided by Elsevier’s International Center for the Study of Research (ICSR) lab to investigate collaboration patterns across disciplines over time and to understand factors that influence article metrics. XX what did we find XX</w:t>
+        <w:t xml:space="preserve">-index, gender, number of institutions) interact with team size to shape research impact. Understanding these dynamics is essential given their influence on hiring, tenure, and the broader scientific ecosystem. Using metadata from Elsevier’s International Center for the Study of Research (ICSR) Lab, we examined collaboration trends across disciplines and their associations with citation outcomes. Team size increased over time, with variation by discipline, and was positively associated with citation counts. Gender effects on citation rates varied by authorship order and discipline, indicating a complex relationship between gender and impact. Greater institutional and geographic diversity were linked to citation advantages. Last authors’</w:t>
+      </w:r>
+      <w:r>
+        <w:t xml:space="preserve"> </w:t>
+      </w:r>
+      <w:r>
+        <w:rPr>
+          <w:i/>
+          <w:iCs/>
+        </w:rPr>
+        <w:t xml:space="preserve">h</w:t>
+      </w:r>
+      <w:r>
+        <w:t xml:space="preserve">-indices were especially predictive of impact, particularly when self-citations were excluded. These findings highlight how evolving patterns of collaboration influence research visibility and underscore the importance of considering team composition in evaluations of scientific output.</w:t>
       </w:r>
       <w:r>
         <w:t xml:space="preserve"> </w:t>
@@ -247,7 +260,7 @@
         <w:t xml:space="preserve"> </w:t>
       </w:r>
       <w:r>
-        <w:t xml:space="preserve">many fields of study such as biomedical sciences</w:t>
+        <w:t xml:space="preserve">many fields of study, such as biomedical sciences</w:t>
       </w:r>
       <w:r>
         <w:rPr>
@@ -328,31 +341,31 @@
         <w:t xml:space="preserve"> </w:t>
       </w:r>
       <w:r>
-        <w:t xml:space="preserve">these metrics. Authorship team diversity is a key factor one may</w:t>
-      </w:r>
-      <w:r>
-        <w:t xml:space="preserve"> </w:t>
-      </w:r>
-      <w:r>
-        <w:t xml:space="preserve">consider when looking at the impact of collaboration on article metrics.</w:t>
-      </w:r>
-      <w:r>
-        <w:t xml:space="preserve"> </w:t>
-      </w:r>
-      <w:r>
-        <w:t xml:space="preserve">Author diversity, broadly speaking, has been associated with positive</w:t>
-      </w:r>
-      <w:r>
-        <w:t xml:space="preserve"> </w:t>
-      </w:r>
-      <w:r>
-        <w:t xml:space="preserve">outcomes such as publication in high impact factor journals, rates of</w:t>
-      </w:r>
-      <w:r>
-        <w:t xml:space="preserve"> </w:t>
-      </w:r>
-      <w:r>
-        <w:t xml:space="preserve">citations, and funding</w:t>
+        <w:t xml:space="preserve">these metrics. Authorship team diversity is a key factor to be</w:t>
+      </w:r>
+      <w:r>
+        <w:t xml:space="preserve"> </w:t>
+      </w:r>
+      <w:r>
+        <w:t xml:space="preserve">considered when looking at the impact of collaboration on article</w:t>
+      </w:r>
+      <w:r>
+        <w:t xml:space="preserve"> </w:t>
+      </w:r>
+      <w:r>
+        <w:t xml:space="preserve">metrics. Author diversity, broadly speaking, has been associated with</w:t>
+      </w:r>
+      <w:r>
+        <w:t xml:space="preserve"> </w:t>
+      </w:r>
+      <w:r>
+        <w:t xml:space="preserve">positive outcomes such as publication in high-impact factor journals,</w:t>
+      </w:r>
+      <w:r>
+        <w:t xml:space="preserve"> </w:t>
+      </w:r>
+      <w:r>
+        <w:t xml:space="preserve">rates of citations, and funding</w:t>
       </w:r>
       <w:r>
         <w:rPr>
@@ -361,43 +374,43 @@
         <w:t xml:space="preserve">7,8</w:t>
       </w:r>
       <w:r>
-        <w:t xml:space="preserve">. It is important to</w:t>
-      </w:r>
-      <w:r>
-        <w:t xml:space="preserve"> </w:t>
-      </w:r>
-      <w:r>
-        <w:t xml:space="preserve">note that author diversity can be conceptualized along a continuum of</w:t>
-      </w:r>
-      <w:r>
-        <w:t xml:space="preserve"> </w:t>
-      </w:r>
-      <w:r>
-        <w:t xml:space="preserve">factors such as: gender, physical location (e.g., United States,</w:t>
-      </w:r>
-      <w:r>
-        <w:t xml:space="preserve"> </w:t>
-      </w:r>
-      <w:r>
-        <w:t xml:space="preserve">Brazil), institutional affiliation, discipline, and rank (e.g.,</w:t>
-      </w:r>
-      <w:r>
-        <w:t xml:space="preserve"> </w:t>
-      </w:r>
-      <w:r>
-        <w:t xml:space="preserve">associate faculty). Evidence suggests an impact of international</w:t>
-      </w:r>
-      <w:r>
-        <w:t xml:space="preserve"> </w:t>
-      </w:r>
-      <w:r>
-        <w:t xml:space="preserve">collaboration, rank, and gender on article metrics in fields such as</w:t>
-      </w:r>
-      <w:r>
-        <w:t xml:space="preserve"> </w:t>
-      </w:r>
-      <w:r>
-        <w:t xml:space="preserve">sport science research</w:t>
+        <w:t xml:space="preserve">. It is</w:t>
+      </w:r>
+      <w:r>
+        <w:t xml:space="preserve"> </w:t>
+      </w:r>
+      <w:r>
+        <w:t xml:space="preserve">important to note that author diversity can be conceptualized along a</w:t>
+      </w:r>
+      <w:r>
+        <w:t xml:space="preserve"> </w:t>
+      </w:r>
+      <w:r>
+        <w:t xml:space="preserve">continuum of factors such as gender, physical location (e.g., United</w:t>
+      </w:r>
+      <w:r>
+        <w:t xml:space="preserve"> </w:t>
+      </w:r>
+      <w:r>
+        <w:t xml:space="preserve">States, Brazil), institutional affiliation, discipline, and rank.</w:t>
+      </w:r>
+      <w:r>
+        <w:t xml:space="preserve"> </w:t>
+      </w:r>
+      <w:r>
+        <w:t xml:space="preserve">Evidence suggests the impact of international collaboration, rank, and</w:t>
+      </w:r>
+      <w:r>
+        <w:t xml:space="preserve"> </w:t>
+      </w:r>
+      <w:r>
+        <w:t xml:space="preserve">gender on article metrics in fields such as sport science</w:t>
+      </w:r>
+      <w:r>
+        <w:t xml:space="preserve"> </w:t>
+      </w:r>
+      <w:r>
+        <w:t xml:space="preserve">research</w:t>
       </w:r>
       <w:r>
         <w:rPr>
@@ -415,13 +428,7 @@
         <w:t xml:space="preserve">6</w:t>
       </w:r>
       <w:r>
-        <w:t xml:space="preserve">, and</w:t>
-      </w:r>
-      <w:r>
-        <w:t xml:space="preserve"> </w:t>
-      </w:r>
-      <w:r>
-        <w:t xml:space="preserve">psychology</w:t>
+        <w:t xml:space="preserve">, and psychology</w:t>
       </w:r>
       <w:r>
         <w:rPr>
@@ -430,43 +437,43 @@
         <w:t xml:space="preserve">10</w:t>
       </w:r>
       <w:r>
-        <w:t xml:space="preserve">, respectively, but a gap exists in which the</w:t>
-      </w:r>
-      <w:r>
-        <w:t xml:space="preserve"> </w:t>
-      </w:r>
-      <w:r>
-        <w:t xml:space="preserve">accumulation of these factors over time and across disciplines has not</w:t>
-      </w:r>
-      <w:r>
-        <w:t xml:space="preserve"> </w:t>
-      </w:r>
-      <w:r>
-        <w:t xml:space="preserve">yet been addressed. As such, this project aims to understand: 1a.) What</w:t>
-      </w:r>
-      <w:r>
-        <w:t xml:space="preserve"> </w:t>
-      </w:r>
-      <w:r>
-        <w:t xml:space="preserve">is the pattern of team size distribution within various disciplines over</w:t>
-      </w:r>
-      <w:r>
-        <w:t xml:space="preserve"> </w:t>
-      </w:r>
-      <w:r>
-        <w:t xml:space="preserve">time, 1b.) is team size related to article impact?, and 2.) What</w:t>
-      </w:r>
-      <w:r>
-        <w:t xml:space="preserve"> </w:t>
-      </w:r>
-      <w:r>
-        <w:t xml:space="preserve">characteristics of team composition have the greatest influence on</w:t>
-      </w:r>
-      <w:r>
-        <w:t xml:space="preserve"> </w:t>
-      </w:r>
-      <w:r>
-        <w:t xml:space="preserve">article metrics?</w:t>
+        <w:t xml:space="preserve">,</w:t>
+      </w:r>
+      <w:r>
+        <w:t xml:space="preserve"> </w:t>
+      </w:r>
+      <w:r>
+        <w:t xml:space="preserve">respectively, but a gap exists in which the accumulation of these</w:t>
+      </w:r>
+      <w:r>
+        <w:t xml:space="preserve"> </w:t>
+      </w:r>
+      <w:r>
+        <w:t xml:space="preserve">factors over time and across disciplines has not yet been addressed. As</w:t>
+      </w:r>
+      <w:r>
+        <w:t xml:space="preserve"> </w:t>
+      </w:r>
+      <w:r>
+        <w:t xml:space="preserve">such, this project aims to understand: 1a.) What is the pattern of team</w:t>
+      </w:r>
+      <w:r>
+        <w:t xml:space="preserve"> </w:t>
+      </w:r>
+      <w:r>
+        <w:t xml:space="preserve">size distribution within various disciplines over time, 1b.) is team</w:t>
+      </w:r>
+      <w:r>
+        <w:t xml:space="preserve"> </w:t>
+      </w:r>
+      <w:r>
+        <w:t xml:space="preserve">size related to article impact?, and 2.) What characteristics of team</w:t>
+      </w:r>
+      <w:r>
+        <w:t xml:space="preserve"> </w:t>
+      </w:r>
+      <w:r>
+        <w:t xml:space="preserve">composition have the greatest influence on article metrics?</w:t>
       </w:r>
     </w:p>
     <w:bookmarkStart w:id="21" w:name="Xb0a03e5daa75ab7fa5e1a548c1da16961f855e0"/>
@@ -571,7 +578,7 @@
         <w:t xml:space="preserve"> </w:t>
       </w:r>
       <w:r>
-        <w:t xml:space="preserve">across various disciplines including science and engineering, social</w:t>
+        <w:t xml:space="preserve">across various disciplines, including science and engineering, social</w:t>
       </w:r>
       <w:r>
         <w:t xml:space="preserve"> </w:t>
@@ -592,7 +599,7 @@
         <w:t xml:space="preserve"> </w:t>
       </w:r>
       <w:r>
-        <w:t xml:space="preserve">suggests an overall trend towards collaboration</w:t>
+        <w:t xml:space="preserve">suggests an overall trend toward collaboration</w:t>
       </w:r>
       <w:r>
         <w:rPr>
@@ -630,19 +637,19 @@
         <w:t xml:space="preserve"> </w:t>
       </w:r>
       <w:r>
-        <w:t xml:space="preserve">reportedly doubled over the last 45 years, whereas for mathematics, the</w:t>
-      </w:r>
-      <w:r>
-        <w:t xml:space="preserve"> </w:t>
-      </w:r>
-      <w:r>
-        <w:t xml:space="preserve">growth appears slower - with the average team size rising from 1.22 to</w:t>
-      </w:r>
-      <w:r>
-        <w:t xml:space="preserve"> </w:t>
-      </w:r>
-      <w:r>
-        <w:t xml:space="preserve">1.85. Grossman</w:t>
+        <w:t xml:space="preserve">doubled over the last 45 years, whereas for mathematics, the growth</w:t>
+      </w:r>
+      <w:r>
+        <w:t xml:space="preserve"> </w:t>
+      </w:r>
+      <w:r>
+        <w:t xml:space="preserve">appears slower - with the average team size rising from 1.22 to 1.85.</w:t>
+      </w:r>
+      <w:r>
+        <w:t xml:space="preserve"> </w:t>
+      </w:r>
+      <w:r>
+        <w:t xml:space="preserve">Grossman</w:t>
       </w:r>
       <w:r>
         <w:rPr>
@@ -660,13 +667,13 @@
         <w:t xml:space="preserve"> </w:t>
       </w:r>
       <w:r>
-        <w:t xml:space="preserve">mathematics the average number of collaborators has grown since the</w:t>
-      </w:r>
-      <w:r>
-        <w:t xml:space="preserve"> </w:t>
-      </w:r>
-      <w:r>
-        <w:t xml:space="preserve">1940s with 1 in 8 papers having 2+ authors. On the other hand, a review</w:t>
+        <w:t xml:space="preserve">mathematics, the average number of collaborators has grown since the</w:t>
+      </w:r>
+      <w:r>
+        <w:t xml:space="preserve"> </w:t>
+      </w:r>
+      <w:r>
+        <w:t xml:space="preserve">1940s, with 1 in 8 papers having 2+ authors. On the other hand, a review</w:t>
       </w:r>
       <w:r>
         <w:t xml:space="preserve"> </w:t>
@@ -702,13 +709,13 @@
         <w:t xml:space="preserve"> </w:t>
       </w:r>
       <w:r>
-        <w:t xml:space="preserve">decreases in single-authored papers across specific subareas (i.e.,</w:t>
-      </w:r>
-      <w:r>
-        <w:t xml:space="preserve"> </w:t>
-      </w:r>
-      <w:r>
-        <w:t xml:space="preserve">Ecology, Genetics, Zoology and Botany)</w:t>
+        <w:t xml:space="preserve">decreases in single-authored papers across specific subareas (e.g.,</w:t>
+      </w:r>
+      <w:r>
+        <w:t xml:space="preserve"> </w:t>
+      </w:r>
+      <w:r>
+        <w:t xml:space="preserve">Ecology, Genetics, Zoology, and Botany)</w:t>
       </w:r>
       <w:r>
         <w:rPr>
@@ -853,7 +860,7 @@
         <w:t xml:space="preserve"> </w:t>
       </w:r>
       <w:r>
-        <w:t xml:space="preserve">authors, as number of authors appears to be associated with article</w:t>
+        <w:t xml:space="preserve">authors, as the number of authors appears to be associated with article</w:t>
       </w:r>
       <w:r>
         <w:t xml:space="preserve"> </w:t>
@@ -865,19 +872,19 @@
         <w:t xml:space="preserve"> </w:t>
       </w:r>
       <w:r>
-        <w:t xml:space="preserve">volumes of the Web of Knowledge™ in 2007, single</w:t>
-      </w:r>
-      <w:r>
-        <w:t xml:space="preserve"> </w:t>
-      </w:r>
-      <w:r>
-        <w:t xml:space="preserve">author papers received an average of 2.91 citations while multi-author</w:t>
-      </w:r>
-      <w:r>
-        <w:t xml:space="preserve"> </w:t>
-      </w:r>
-      <w:r>
-        <w:t xml:space="preserve">papers exhibited an average of 5.39</w:t>
+        <w:t xml:space="preserve">volumes of the Web of Knowledge™ in 2007, single-author papers received</w:t>
+      </w:r>
+      <w:r>
+        <w:t xml:space="preserve"> </w:t>
+      </w:r>
+      <w:r>
+        <w:t xml:space="preserve">an average of 2.91 citations while multi-author papers exhibited an</w:t>
+      </w:r>
+      <w:r>
+        <w:t xml:space="preserve"> </w:t>
+      </w:r>
+      <w:r>
+        <w:t xml:space="preserve">average of 5.39</w:t>
       </w:r>
       <w:r>
         <w:rPr>
@@ -886,37 +893,37 @@
         <w:t xml:space="preserve">20</w:t>
       </w:r>
       <w:r>
-        <w:t xml:space="preserve">; this difference was</w:t>
-      </w:r>
-      <w:r>
-        <w:t xml:space="preserve"> </w:t>
-      </w:r>
-      <w:r>
-        <w:t xml:space="preserve">consistent when examining citation averages from 1998 to 2007. Further</w:t>
-      </w:r>
-      <w:r>
-        <w:t xml:space="preserve"> </w:t>
-      </w:r>
-      <w:r>
-        <w:t xml:space="preserve">probing this relationship it appears that the number of citations</w:t>
-      </w:r>
-      <w:r>
-        <w:t xml:space="preserve"> </w:t>
-      </w:r>
-      <w:r>
-        <w:t xml:space="preserve">increases with the number of authors, up to a point (approx. 20 authors)</w:t>
-      </w:r>
-      <w:r>
-        <w:t xml:space="preserve"> </w:t>
-      </w:r>
-      <w:r>
-        <w:t xml:space="preserve">after which the relationship becomes inconsistent. As such,</w:t>
-      </w:r>
-      <w:r>
-        <w:t xml:space="preserve"> </w:t>
-      </w:r>
-      <w:r>
-        <w:t xml:space="preserve">collaboration may be rewarded by increased impact.</w:t>
+        <w:t xml:space="preserve">; this difference was consistent when</w:t>
+      </w:r>
+      <w:r>
+        <w:t xml:space="preserve"> </w:t>
+      </w:r>
+      <w:r>
+        <w:t xml:space="preserve">examining citation averages from 1998 to 2007. Further probing this</w:t>
+      </w:r>
+      <w:r>
+        <w:t xml:space="preserve"> </w:t>
+      </w:r>
+      <w:r>
+        <w:t xml:space="preserve">relationship, it appears that the number of citations increases with the</w:t>
+      </w:r>
+      <w:r>
+        <w:t xml:space="preserve"> </w:t>
+      </w:r>
+      <w:r>
+        <w:t xml:space="preserve">number of authors, up to a point (approx. 20 authors) after which the</w:t>
+      </w:r>
+      <w:r>
+        <w:t xml:space="preserve"> </w:t>
+      </w:r>
+      <w:r>
+        <w:t xml:space="preserve">relationship becomes inconsistent. As such, collaboration may be</w:t>
+      </w:r>
+      <w:r>
+        <w:t xml:space="preserve"> </w:t>
+      </w:r>
+      <w:r>
+        <w:t xml:space="preserve">rewarded by increased impact.</w:t>
       </w:r>
     </w:p>
     <w:p>
@@ -936,7 +943,7 @@
         <w:t xml:space="preserve"> </w:t>
       </w:r>
       <w:r>
-        <w:t xml:space="preserve">examine manuscripts published in a narrow time frame (i.e., ten</w:t>
+        <w:t xml:space="preserve">examine manuscripts published in a narrow time frame (e.g., ten</w:t>
       </w:r>
       <w:r>
         <w:t xml:space="preserve"> </w:t>
@@ -1024,7 +1031,7 @@
         <w:t xml:space="preserve"> </w:t>
       </w:r>
       <w:r>
-        <w:t xml:space="preserve">past several decades, it is important to ask the question about who is</w:t>
+        <w:t xml:space="preserve">past several decades, it is important to ask the question of who is</w:t>
       </w:r>
       <w:r>
         <w:t xml:space="preserve"> </w:t>
@@ -1084,7 +1091,7 @@
         <w:t xml:space="preserve"> </w:t>
       </w:r>
       <w:r>
-        <w:t xml:space="preserve">in regard to publishing articles in specific areas of</w:t>
+        <w:t xml:space="preserve">regarding publishing articles in specific areas of</w:t>
       </w:r>
       <w:r>
         <w:t xml:space="preserve"> </w:t>
@@ -1135,7 +1142,7 @@
         <w:t xml:space="preserve"> </w:t>
       </w:r>
       <w:r>
-        <w:t xml:space="preserve">these differences varies by subfield (e.g., computational biology, as</w:t>
+        <w:t xml:space="preserve">these differences vary by subfield (e.g., computational biology, as</w:t>
       </w:r>
       <w:r>
         <w:t xml:space="preserve"> </w:t>
@@ -1150,19 +1157,19 @@
         <w:t xml:space="preserve">29</w:t>
       </w:r>
       <w:r>
-        <w:t xml:space="preserve">. Furthermore, women are</w:t>
-      </w:r>
-      <w:r>
-        <w:t xml:space="preserve"> </w:t>
-      </w:r>
-      <w:r>
-        <w:t xml:space="preserve">less likely to receive credit for their contributions to</w:t>
-      </w:r>
-      <w:r>
-        <w:t xml:space="preserve"> </w:t>
-      </w:r>
-      <w:r>
-        <w:t xml:space="preserve">empirical/scholarly written work</w:t>
+        <w:t xml:space="preserve">. Interestingly, women are</w:t>
+      </w:r>
+      <w:r>
+        <w:t xml:space="preserve"> </w:t>
+      </w:r>
+      <w:r>
+        <w:t xml:space="preserve">less likely to collaborate with previous co-authors compared to</w:t>
+      </w:r>
+      <w:r>
+        <w:t xml:space="preserve"> </w:t>
+      </w:r>
+      <w:r>
+        <w:t xml:space="preserve">men</w:t>
       </w:r>
       <w:r>
         <w:rPr>
@@ -1171,46 +1178,25 @@
         <w:t xml:space="preserve">30</w:t>
       </w:r>
       <w:r>
-        <w:t xml:space="preserve">. Interestingly, women are</w:t>
-      </w:r>
-      <w:r>
-        <w:t xml:space="preserve"> </w:t>
-      </w:r>
-      <w:r>
-        <w:t xml:space="preserve">less likely to collaborate with previous co-authors compared to</w:t>
-      </w:r>
-      <w:r>
-        <w:t xml:space="preserve"> </w:t>
-      </w:r>
-      <w:r>
-        <w:t xml:space="preserve">men</w:t>
+        <w:t xml:space="preserve">; although it is not clear why this is the case, it could</w:t>
+      </w:r>
+      <w:r>
+        <w:t xml:space="preserve"> </w:t>
+      </w:r>
+      <w:r>
+        <w:t xml:space="preserve">have important implications for their careers as novel teams tend to</w:t>
+      </w:r>
+      <w:r>
+        <w:t xml:space="preserve"> </w:t>
+      </w:r>
+      <w:r>
+        <w:t xml:space="preserve">produce higher-impact work</w:t>
       </w:r>
       <w:r>
         <w:rPr>
           <w:vertAlign w:val="superscript"/>
         </w:rPr>
         <w:t xml:space="preserve">31</w:t>
-      </w:r>
-      <w:r>
-        <w:t xml:space="preserve">; although it is not clear why this is the case, it could</w:t>
-      </w:r>
-      <w:r>
-        <w:t xml:space="preserve"> </w:t>
-      </w:r>
-      <w:r>
-        <w:t xml:space="preserve">have important implications for their careers as novel teams tend to</w:t>
-      </w:r>
-      <w:r>
-        <w:t xml:space="preserve"> </w:t>
-      </w:r>
-      <w:r>
-        <w:t xml:space="preserve">produce higher-impact work</w:t>
-      </w:r>
-      <w:r>
-        <w:rPr>
-          <w:vertAlign w:val="superscript"/>
-        </w:rPr>
-        <w:t xml:space="preserve">32</w:t>
       </w:r>
       <w:r>
         <w:t xml:space="preserve">.</w:t>
@@ -1221,76 +1207,91 @@
         <w:pStyle w:val="Textkrper"/>
       </w:pPr>
       <w:r>
-        <w:t xml:space="preserve">Compounding this lack of representation is a body of research suggesting</w:t>
-      </w:r>
-      <w:r>
-        <w:t xml:space="preserve"> </w:t>
-      </w:r>
-      <w:r>
-        <w:t xml:space="preserve">that women’s contributions to science via peer-reviewed publications are</w:t>
-      </w:r>
-      <w:r>
-        <w:t xml:space="preserve"> </w:t>
-      </w:r>
-      <w:r>
-        <w:t xml:space="preserve">often perceived to have lesser value than publications authored by men.</w:t>
-      </w:r>
-      <w:r>
-        <w:t xml:space="preserve"> </w:t>
-      </w:r>
-      <w:r>
-        <w:t xml:space="preserve">After controlling for year of publication, publication outlet, focus,</w:t>
-      </w:r>
-      <w:r>
-        <w:t xml:space="preserve"> </w:t>
-      </w:r>
-      <w:r>
-        <w:t xml:space="preserve">theoretical framework, methodology, tenure status, and institutional</w:t>
-      </w:r>
-      <w:r>
-        <w:t xml:space="preserve"> </w:t>
-      </w:r>
-      <w:r>
-        <w:t xml:space="preserve">affiliation, women were still cited less than men</w:t>
+        <w:t xml:space="preserve">Furthermore, women are less likely to receive credit for their</w:t>
+      </w:r>
+      <w:r>
+        <w:t xml:space="preserve"> </w:t>
+      </w:r>
+      <w:r>
+        <w:t xml:space="preserve">contributions to empirical and scholarly work</w:t>
       </w:r>
       <w:r>
         <w:rPr>
           <w:vertAlign w:val="superscript"/>
         </w:rPr>
+        <w:t xml:space="preserve">32</w:t>
+      </w:r>
+      <w:r>
+        <w:t xml:space="preserve">. A growing body</w:t>
+      </w:r>
+      <w:r>
+        <w:t xml:space="preserve"> </w:t>
+      </w:r>
+      <w:r>
+        <w:t xml:space="preserve">of research suggests that contributions by women to peer-reviewed</w:t>
+      </w:r>
+      <w:r>
+        <w:t xml:space="preserve"> </w:t>
+      </w:r>
+      <w:r>
+        <w:t xml:space="preserve">publications are often perceived as less valuable than those authored by</w:t>
+      </w:r>
+      <w:r>
+        <w:t xml:space="preserve"> </w:t>
+      </w:r>
+      <w:r>
+        <w:t xml:space="preserve">men. After controlling for the year of publication, publication outlet,</w:t>
+      </w:r>
+      <w:r>
+        <w:t xml:space="preserve"> </w:t>
+      </w:r>
+      <w:r>
+        <w:t xml:space="preserve">focus, theoretical framework, methodology, tenure status, and</w:t>
+      </w:r>
+      <w:r>
+        <w:t xml:space="preserve"> </w:t>
+      </w:r>
+      <w:r>
+        <w:t xml:space="preserve">institutional affiliation, women were still cited less than</w:t>
+      </w:r>
+      <w:r>
+        <w:t xml:space="preserve"> </w:t>
+      </w:r>
+      <w:r>
+        <w:t xml:space="preserve">men</w:t>
+      </w:r>
+      <w:r>
+        <w:rPr>
+          <w:vertAlign w:val="superscript"/>
+        </w:rPr>
         <w:t xml:space="preserve">33</w:t>
       </w:r>
       <w:r>
-        <w:t xml:space="preserve">.</w:t>
-      </w:r>
-      <w:r>
-        <w:t xml:space="preserve"> </w:t>
-      </w:r>
-      <w:r>
-        <w:t xml:space="preserve">Relevant to this manuscript is the body of research examining the</w:t>
-      </w:r>
-      <w:r>
-        <w:t xml:space="preserve"> </w:t>
-      </w:r>
-      <w:r>
-        <w:t xml:space="preserve">association between gender and citation rates. Previous work has noted</w:t>
-      </w:r>
-      <w:r>
-        <w:t xml:space="preserve"> </w:t>
-      </w:r>
-      <w:r>
-        <w:t xml:space="preserve">that in specific fields, men are less likely to cite women’s work and</w:t>
-      </w:r>
-      <w:r>
-        <w:t xml:space="preserve"> </w:t>
-      </w:r>
-      <w:r>
-        <w:t xml:space="preserve">work authored by women typically receives fewer citations</w:t>
-      </w:r>
-      <w:r>
-        <w:t xml:space="preserve"> </w:t>
-      </w:r>
-      <w:r>
-        <w:t xml:space="preserve">overall</w:t>
+        <w:t xml:space="preserve">. Relevant to this manuscript is the body of research</w:t>
+      </w:r>
+      <w:r>
+        <w:t xml:space="preserve"> </w:t>
+      </w:r>
+      <w:r>
+        <w:t xml:space="preserve">examining the association between gender and citation rates. Previous</w:t>
+      </w:r>
+      <w:r>
+        <w:t xml:space="preserve"> </w:t>
+      </w:r>
+      <w:r>
+        <w:t xml:space="preserve">work has noted that in specific fields, men are less likely to cite</w:t>
+      </w:r>
+      <w:r>
+        <w:t xml:space="preserve"> </w:t>
+      </w:r>
+      <w:r>
+        <w:t xml:space="preserve">women’s work and work authored by women typically receives fewer</w:t>
+      </w:r>
+      <w:r>
+        <w:t xml:space="preserve"> </w:t>
+      </w:r>
+      <w:r>
+        <w:t xml:space="preserve">citations overall</w:t>
       </w:r>
       <w:r>
         <w:rPr>
@@ -1299,13 +1300,13 @@
         <w:t xml:space="preserve">34,35</w:t>
       </w:r>
       <w:r>
-        <w:t xml:space="preserve">. This difference in likelihood of</w:t>
-      </w:r>
-      <w:r>
-        <w:t xml:space="preserve"> </w:t>
-      </w:r>
-      <w:r>
-        <w:t xml:space="preserve">accumulating citations could influence a researchers’</w:t>
+        <w:t xml:space="preserve">. This difference in the</w:t>
+      </w:r>
+      <w:r>
+        <w:t xml:space="preserve"> </w:t>
+      </w:r>
+      <w:r>
+        <w:t xml:space="preserve">likelihood of accumulating citations could influence a researchers’</w:t>
       </w:r>
       <w:r>
         <w:t xml:space="preserve"> </w:t>
@@ -1456,7 +1457,7 @@
         <w:t xml:space="preserve">h</w:t>
       </w:r>
       <w:r>
-        <w:t xml:space="preserve">-indices which favor men. Women professors have a significantly lower</w:t>
+        <w:t xml:space="preserve">-indices that favor men. Women professors have a significantly lower</w:t>
       </w:r>
       <w:r>
         <w:t xml:space="preserve"> </w:t>
@@ -1515,7 +1516,7 @@
         <w:t xml:space="preserve"> </w:t>
       </w:r>
       <w:r>
-        <w:t xml:space="preserve">practically, translated to an astounding effect of a $13,100 a year</w:t>
+        <w:t xml:space="preserve">practically translated to an astounding effect of $13,100 a year</w:t>
       </w:r>
       <w:r>
         <w:t xml:space="preserve"> </w:t>
@@ -1538,46 +1539,7 @@
         <w:pStyle w:val="Textkrper"/>
       </w:pPr>
       <w:r>
-        <w:t xml:space="preserve">It is important to note that there is evidence of increasing equity</w:t>
-      </w:r>
-      <w:r>
-        <w:t xml:space="preserve"> </w:t>
-      </w:r>
-      <w:r>
-        <w:t xml:space="preserve">between genders in certain fields; in international relations, for</w:t>
-      </w:r>
-      <w:r>
-        <w:t xml:space="preserve"> </w:t>
-      </w:r>
-      <w:r>
-        <w:t xml:space="preserve">example, the gap between men and women’s manuscript submissions and</w:t>
-      </w:r>
-      <w:r>
-        <w:t xml:space="preserve"> </w:t>
-      </w:r>
-      <w:r>
-        <w:t xml:space="preserve">publications are narrowing and there appears to be no significant</w:t>
-      </w:r>
-      <w:r>
-        <w:t xml:space="preserve"> </w:t>
-      </w:r>
-      <w:r>
-        <w:t xml:space="preserve">relationship between gender and citation count</w:t>
-      </w:r>
-      <w:r>
-        <w:rPr>
-          <w:vertAlign w:val="superscript"/>
-        </w:rPr>
-        <w:t xml:space="preserve">39</w:t>
-      </w:r>
-      <w:r>
-        <w:t xml:space="preserve">. Notable, is</w:t>
-      </w:r>
-      <w:r>
-        <w:t xml:space="preserve"> </w:t>
-      </w:r>
-      <w:r>
-        <w:t xml:space="preserve">that the calculation of</w:t>
+        <w:t xml:space="preserve">Notable is that the calculation of</w:t>
       </w:r>
       <w:r>
         <w:t xml:space="preserve"> </w:t>
@@ -1590,25 +1552,25 @@
         <w:t xml:space="preserve">h</w:t>
       </w:r>
       <w:r>
-        <w:t xml:space="preserve">-indices may be particularly biased by</w:t>
-      </w:r>
-      <w:r>
-        <w:t xml:space="preserve"> </w:t>
-      </w:r>
-      <w:r>
-        <w:t xml:space="preserve">self-citations and years without publication. Higher rates of citations</w:t>
-      </w:r>
-      <w:r>
-        <w:t xml:space="preserve"> </w:t>
-      </w:r>
-      <w:r>
-        <w:t xml:space="preserve">received by men were partially explained by high rates of self-citation</w:t>
-      </w:r>
-      <w:r>
-        <w:t xml:space="preserve"> </w:t>
-      </w:r>
-      <w:r>
-        <w:t xml:space="preserve">which altered scores up to 14 extra</w:t>
+        <w:t xml:space="preserve">-indices may be particularly</w:t>
+      </w:r>
+      <w:r>
+        <w:t xml:space="preserve"> </w:t>
+      </w:r>
+      <w:r>
+        <w:t xml:space="preserve">biased by self-citations and years without publication. Higher rates of</w:t>
+      </w:r>
+      <w:r>
+        <w:t xml:space="preserve"> </w:t>
+      </w:r>
+      <w:r>
+        <w:t xml:space="preserve">citations received by men were partially explained by high rates of</w:t>
+      </w:r>
+      <w:r>
+        <w:t xml:space="preserve"> </w:t>
+      </w:r>
+      <w:r>
+        <w:t xml:space="preserve">self-citation which altered scores up to 14 extra</w:t>
       </w:r>
       <w:r>
         <w:t xml:space="preserve"> </w:t>
@@ -1621,13 +1583,19 @@
         <w:t xml:space="preserve">h</w:t>
       </w:r>
       <w:r>
-        <w:t xml:space="preserve">-index points. Women also engaged</w:t>
-      </w:r>
-      <w:r>
-        <w:t xml:space="preserve"> </w:t>
-      </w:r>
-      <w:r>
-        <w:t xml:space="preserve">in self-citation, although less so, and only impacting their</w:t>
+        <w:t xml:space="preserve">-index points.</w:t>
+      </w:r>
+      <w:r>
+        <w:t xml:space="preserve"> </w:t>
+      </w:r>
+      <w:r>
+        <w:t xml:space="preserve">Women also engaged in self-citation, although less so, and only</w:t>
+      </w:r>
+      <w:r>
+        <w:t xml:space="preserve"> </w:t>
+      </w:r>
+      <w:r>
+        <w:t xml:space="preserve">impacting their</w:t>
       </w:r>
       <w:r>
         <w:t xml:space="preserve"> </w:t>
@@ -1640,13 +1608,7 @@
         <w:t xml:space="preserve">h</w:t>
       </w:r>
       <w:r>
-        <w:t xml:space="preserve">-index</w:t>
-      </w:r>
-      <w:r>
-        <w:t xml:space="preserve"> </w:t>
-      </w:r>
-      <w:r>
-        <w:t xml:space="preserve">by up to 5 points</w:t>
+        <w:t xml:space="preserve">-index by up to 5 points</w:t>
       </w:r>
       <w:r>
         <w:rPr>
@@ -1655,7 +1617,52 @@
         <w:t xml:space="preserve">34</w:t>
       </w:r>
       <w:r>
-        <w:t xml:space="preserve">. Although there are alternatives to the</w:t>
+        <w:t xml:space="preserve">. It is</w:t>
+      </w:r>
+      <w:r>
+        <w:t xml:space="preserve"> </w:t>
+      </w:r>
+      <w:r>
+        <w:t xml:space="preserve">important to note that there is evidence of increasing equity between</w:t>
+      </w:r>
+      <w:r>
+        <w:t xml:space="preserve"> </w:t>
+      </w:r>
+      <w:r>
+        <w:t xml:space="preserve">genders in certain fields; in international relations, for example, the</w:t>
+      </w:r>
+      <w:r>
+        <w:t xml:space="preserve"> </w:t>
+      </w:r>
+      <w:r>
+        <w:t xml:space="preserve">gap between men’s and women’s manuscript submissions and publications</w:t>
+      </w:r>
+      <w:r>
+        <w:t xml:space="preserve"> </w:t>
+      </w:r>
+      <w:r>
+        <w:t xml:space="preserve">are narrowing, and there appears to be no significant relationship</w:t>
+      </w:r>
+      <w:r>
+        <w:t xml:space="preserve"> </w:t>
+      </w:r>
+      <w:r>
+        <w:t xml:space="preserve">between gender and citation count</w:t>
+      </w:r>
+      <w:r>
+        <w:rPr>
+          <w:vertAlign w:val="superscript"/>
+        </w:rPr>
+        <w:t xml:space="preserve">39</w:t>
+      </w:r>
+      <w:r>
+        <w:t xml:space="preserve">. Although there are</w:t>
+      </w:r>
+      <w:r>
+        <w:t xml:space="preserve"> </w:t>
+      </w:r>
+      <w:r>
+        <w:t xml:space="preserve">alternatives to the</w:t>
       </w:r>
       <w:r>
         <w:t xml:space="preserve"> </w:t>
@@ -1668,7 +1675,7 @@
         <w:t xml:space="preserve">h</w:t>
       </w:r>
       <w:r>
-        <w:t xml:space="preserve">-index that account for self-citations (e.g. the</w:t>
+        <w:t xml:space="preserve">-index that account for self-citations (e.g., the</w:t>
       </w:r>
       <w:r>
         <w:t xml:space="preserve"> </w:t>
@@ -1750,13 +1757,13 @@
         <w:t xml:space="preserve"> </w:t>
       </w:r>
       <w:r>
-        <w:t xml:space="preserve">articles that have the presence of both a U.S. author and at least one</w:t>
-      </w:r>
-      <w:r>
-        <w:t xml:space="preserve"> </w:t>
-      </w:r>
-      <w:r>
-        <w:t xml:space="preserve">international co-author for psychology</w:t>
+        <w:t xml:space="preserve">Psychology articles that have the presence of both a U.S. author and at</w:t>
+      </w:r>
+      <w:r>
+        <w:t xml:space="preserve"> </w:t>
+      </w:r>
+      <w:r>
+        <w:t xml:space="preserve">least one international co-author</w:t>
       </w:r>
       <w:r>
         <w:rPr>
@@ -1765,13 +1772,13 @@
         <w:t xml:space="preserve">41</w:t>
       </w:r>
       <w:r>
-        <w:t xml:space="preserve">. Similar increases</w:t>
-      </w:r>
-      <w:r>
-        <w:t xml:space="preserve"> </w:t>
-      </w:r>
-      <w:r>
-        <w:t xml:space="preserve">in the fraction of internationally co-authored papers (i.e., ratio of</w:t>
+        <w:t xml:space="preserve">. Similar increases in</w:t>
+      </w:r>
+      <w:r>
+        <w:t xml:space="preserve"> </w:t>
+      </w:r>
+      <w:r>
+        <w:t xml:space="preserve">the fraction of internationally co-authored papers (i.e., ratio of</w:t>
       </w:r>
       <w:r>
         <w:t xml:space="preserve"> </w:t>
@@ -1789,13 +1796,13 @@
         <w:t xml:space="preserve"> </w:t>
       </w:r>
       <w:r>
-        <w:t xml:space="preserve">were noted in other scientific disciplines such as mathematics, biology,</w:t>
-      </w:r>
-      <w:r>
-        <w:t xml:space="preserve"> </w:t>
-      </w:r>
-      <w:r>
-        <w:t xml:space="preserve">medicine, and engineering</w:t>
+        <w:t xml:space="preserve">were noted in other scientific disciplines, such as mathematics,</w:t>
+      </w:r>
+      <w:r>
+        <w:t xml:space="preserve"> </w:t>
+      </w:r>
+      <w:r>
+        <w:t xml:space="preserve">biology, medicine, and engineering</w:t>
       </w:r>
       <w:r>
         <w:rPr>
@@ -1804,19 +1811,25 @@
         <w:t xml:space="preserve">42</w:t>
       </w:r>
       <w:r>
-        <w:t xml:space="preserve">. However, while it appears most</w:t>
-      </w:r>
-      <w:r>
-        <w:t xml:space="preserve"> </w:t>
-      </w:r>
-      <w:r>
-        <w:t xml:space="preserve">fields are increasing international engagement, applied fields</w:t>
-      </w:r>
-      <w:r>
-        <w:t xml:space="preserve"> </w:t>
-      </w:r>
-      <w:r>
-        <w:t xml:space="preserve">(especially medical sciences) have higher rates of growth</w:t>
+        <w:t xml:space="preserve">. However, while it</w:t>
+      </w:r>
+      <w:r>
+        <w:t xml:space="preserve"> </w:t>
+      </w:r>
+      <w:r>
+        <w:t xml:space="preserve">appears most fields are increasing international engagement, applied</w:t>
+      </w:r>
+      <w:r>
+        <w:t xml:space="preserve"> </w:t>
+      </w:r>
+      <w:r>
+        <w:t xml:space="preserve">fields (especially medical sciences) have higher rates of</w:t>
+      </w:r>
+      <w:r>
+        <w:t xml:space="preserve"> </w:t>
+      </w:r>
+      <w:r>
+        <w:t xml:space="preserve">growth</w:t>
       </w:r>
       <w:r>
         <w:rPr>
@@ -1896,7 +1909,13 @@
         <w:t xml:space="preserve"> </w:t>
       </w:r>
       <w:r>
-        <w:t xml:space="preserve">collaboration as evidenced by a citation per paper increase when the authorship team is international</w:t>
+        <w:t xml:space="preserve">collaboration as evidenced by a citation per paper increase when the</w:t>
+      </w:r>
+      <w:r>
+        <w:t xml:space="preserve"> </w:t>
+      </w:r>
+      <w:r>
+        <w:t xml:space="preserve">authorship team is international</w:t>
       </w:r>
       <w:r>
         <w:rPr>
@@ -1944,13 +1963,13 @@
         <w:t xml:space="preserve"> </w:t>
       </w:r>
       <w:r>
-        <w:t xml:space="preserve">paper seem to be greatest for those manuscripts with multiple domestic</w:t>
-      </w:r>
-      <w:r>
-        <w:t xml:space="preserve"> </w:t>
-      </w:r>
-      <w:r>
-        <w:t xml:space="preserve">and international collaborators, and smallest for those with no</w:t>
+        <w:t xml:space="preserve">paper seems to be greatest for those manuscripts with multiple domestic</w:t>
+      </w:r>
+      <w:r>
+        <w:t xml:space="preserve"> </w:t>
+      </w:r>
+      <w:r>
+        <w:t xml:space="preserve">and international collaborators, and the smallest for those with no</w:t>
       </w:r>
       <w:r>
         <w:t xml:space="preserve"> </w:t>
@@ -1997,7 +2016,7 @@
         <w:t xml:space="preserve"> </w:t>
       </w:r>
       <w:r>
-        <w:t xml:space="preserve">science but the extent of this effect varies by which countries are</w:t>
+        <w:t xml:space="preserve">science, but the extent of this effect varies by which countries are</w:t>
       </w:r>
       <w:r>
         <w:t xml:space="preserve"> </w:t>
@@ -2018,7 +2037,7 @@
         <w:t xml:space="preserve"> </w:t>
       </w:r>
       <w:r>
-        <w:t xml:space="preserve">Canada for instance, produced a mean citation rate greater than the</w:t>
+        <w:t xml:space="preserve">Canada, for instance, produced a mean citation rate greater than the</w:t>
       </w:r>
       <w:r>
         <w:t xml:space="preserve"> </w:t>
@@ -2054,7 +2073,7 @@
         <w:t xml:space="preserve"> </w:t>
       </w:r>
       <w:r>
-        <w:t xml:space="preserve">american authors publishing in the top three interdisciplinary journals</w:t>
+        <w:t xml:space="preserve">American authors publishing in the top three interdisciplinary journals</w:t>
       </w:r>
       <w:r>
         <w:t xml:space="preserve"> </w:t>
@@ -2342,7 +2361,7 @@
       </w:r>
     </w:p>
     <w:bookmarkEnd w:id="22"/>
-    <w:bookmarkStart w:id="38" w:name="method"/>
+    <w:bookmarkStart w:id="40" w:name="method"/>
     <w:p>
       <w:pPr>
         <w:pStyle w:val="berschrift1"/>
@@ -2351,7 +2370,7 @@
         <w:t xml:space="preserve">Method</w:t>
       </w:r>
     </w:p>
-    <w:bookmarkStart w:id="28" w:name="ethics-information"/>
+    <w:bookmarkStart w:id="23" w:name="ethics-information"/>
     <w:p>
       <w:pPr>
         <w:pStyle w:val="berschrift2"/>
@@ -2391,16 +2410,20 @@
       <w:r>
         <w:t xml:space="preserve">(§46.101, (b) (4)).</w:t>
       </w:r>
-      <w:r>
-        <w:t xml:space="preserve"> </w:t>
-      </w:r>
-      <w:r>
-        <w:t xml:space="preserve">## Design</w:t>
+    </w:p>
+    <w:bookmarkEnd w:id="23"/>
+    <w:bookmarkStart w:id="30" w:name="design"/>
+    <w:p>
+      <w:pPr>
+        <w:pStyle w:val="berschrift2"/>
+      </w:pPr>
+      <w:r>
+        <w:t xml:space="preserve">Design</w:t>
       </w:r>
     </w:p>
     <w:p>
       <w:pPr>
-        <w:pStyle w:val="Textkrper"/>
+        <w:pStyle w:val="FirstParagraph"/>
       </w:pPr>
       <w:r>
         <w:t xml:space="preserve">This study was an archival data investigation into scholarly publication</w:t>
@@ -2426,7 +2449,7 @@
       <w:r>
         <w:t xml:space="preserve"> </w:t>
       </w:r>
-      <w:hyperlink r:id="rId23">
+      <w:hyperlink r:id="rId24">
         <w:r>
           <w:rPr>
             <w:rStyle w:val="Hyperlink"/>
@@ -2441,7 +2464,7 @@
         <w:t xml:space="preserve"> </w:t>
       </w:r>
       <w:r>
-        <w:t xml:space="preserve">is designed to support researchers’ in their empirical study of</w:t>
+        <w:t xml:space="preserve">is designed to support researchers in their empirical study of</w:t>
       </w:r>
       <w:r>
         <w:t xml:space="preserve"> </w:t>
@@ -2459,25 +2482,25 @@
         <w:t xml:space="preserve"> </w:t>
       </w:r>
       <w:r>
-        <w:t xml:space="preserve">researchers can obtain access to full publication metadata from Scopus</w:t>
-      </w:r>
-      <w:r>
-        <w:t xml:space="preserve"> </w:t>
-      </w:r>
-      <w:r>
-        <w:t xml:space="preserve">including article metrics, author(s), and affiliation information.</w:t>
-      </w:r>
-      <w:r>
-        <w:t xml:space="preserve"> </w:t>
-      </w:r>
-      <w:r>
-        <w:t xml:space="preserve">Scopus is a global database on abstracts and citations, containing a</w:t>
-      </w:r>
-      <w:r>
-        <w:t xml:space="preserve"> </w:t>
-      </w:r>
-      <w:r>
-        <w:t xml:space="preserve">wide representation of content including articles, books, and conference</w:t>
+        <w:t xml:space="preserve">researchers can access full publication metadata from Scopus including</w:t>
+      </w:r>
+      <w:r>
+        <w:t xml:space="preserve"> </w:t>
+      </w:r>
+      <w:r>
+        <w:t xml:space="preserve">article metrics, author(s), and affiliation information. Scopus is a</w:t>
+      </w:r>
+      <w:r>
+        <w:t xml:space="preserve"> </w:t>
+      </w:r>
+      <w:r>
+        <w:t xml:space="preserve">global database of abstracts and citations containing a wide</w:t>
+      </w:r>
+      <w:r>
+        <w:t xml:space="preserve"> </w:t>
+      </w:r>
+      <w:r>
+        <w:t xml:space="preserve">representation of content, including articles, books, and conference</w:t>
       </w:r>
       <w:r>
         <w:t xml:space="preserve"> </w:t>
@@ -2504,10 +2527,16 @@
         <w:t xml:space="preserve"> </w:t>
       </w:r>
       <w:r>
-        <w:t xml:space="preserve">and inclusion of appropriate publications. All variables extracted from this dataset are described below.</w:t>
+        <w:t xml:space="preserve">and inclusion of appropriate publications. All variables extracted from</w:t>
+      </w:r>
+      <w:r>
+        <w:t xml:space="preserve"> </w:t>
+      </w:r>
+      <w:r>
+        <w:t xml:space="preserve">this dataset are described below.</w:t>
       </w:r>
     </w:p>
-    <w:bookmarkStart w:id="25" w:name="variables"/>
+    <w:bookmarkStart w:id="27" w:name="variables"/>
     <w:p>
       <w:pPr>
         <w:pStyle w:val="berschrift3"/>
@@ -2538,7 +2567,7 @@
       <w:r>
         <w:t xml:space="preserve"> </w:t>
       </w:r>
-      <w:hyperlink r:id="rId24">
+      <w:hyperlink r:id="rId25">
         <w:r>
           <w:rPr>
             <w:rStyle w:val="Hyperlink"/>
@@ -2559,55 +2588,49 @@
         <w:t xml:space="preserve"> </w:t>
       </w:r>
       <w:r>
-        <w:t xml:space="preserve">Sciences, and Multidisciplinary)[^We originally planned on using the 27</w:t>
-      </w:r>
-      <w:r>
-        <w:t xml:space="preserve"> </w:t>
-      </w:r>
-      <w:r>
-        <w:t xml:space="preserve">subfields within the ASJC. However, we updated our preregistration to</w:t>
-      </w:r>
-      <w:r>
-        <w:t xml:space="preserve"> </w:t>
-      </w:r>
-      <w:r>
-        <w:t xml:space="preserve">use only five of the larger subfields due to computational constraints].</w:t>
-      </w:r>
-      <w:r>
-        <w:t xml:space="preserve"> </w:t>
-      </w:r>
-      <w:r>
-        <w:t xml:space="preserve">Metric characteristics included citation count (number of times an</w:t>
-      </w:r>
-      <w:r>
-        <w:t xml:space="preserve"> </w:t>
-      </w:r>
-      <w:r>
-        <w:t xml:space="preserve">article was cited within the current data snapshot) and weighted</w:t>
-      </w:r>
-      <w:r>
-        <w:t xml:space="preserve"> </w:t>
-      </w:r>
-      <w:r>
-        <w:t xml:space="preserve">citations. Field weighted citations indicated the number of citations in</w:t>
-      </w:r>
-      <w:r>
-        <w:t xml:space="preserve"> </w:t>
-      </w:r>
-      <w:r>
-        <w:t xml:space="preserve">the last five years. We excluded articles within the last five years for</w:t>
-      </w:r>
-      <w:r>
-        <w:t xml:space="preserve"> </w:t>
-      </w:r>
-      <w:r>
-        <w:t xml:space="preserve">the field weighted citation counts to ensure consistency for this</w:t>
-      </w:r>
-      <w:r>
-        <w:t xml:space="preserve"> </w:t>
-      </w:r>
-      <w:r>
-        <w:t xml:space="preserve">variable.</w:t>
+        <w:t xml:space="preserve">Sciences, and Multidisciplinary).</w:t>
+      </w:r>
+      <w:r>
+        <w:rPr>
+          <w:rStyle w:val="Funotenzeichen"/>
+        </w:rPr>
+        <w:footnoteReference w:id="26"/>
+      </w:r>
+      <w:r>
+        <w:t xml:space="preserve"> </w:t>
+      </w:r>
+      <w:r>
+        <w:t xml:space="preserve">Metric characteristics included</w:t>
+      </w:r>
+      <w:r>
+        <w:t xml:space="preserve"> </w:t>
+      </w:r>
+      <w:r>
+        <w:t xml:space="preserve">citation count (the number of times an article was cited within the</w:t>
+      </w:r>
+      <w:r>
+        <w:t xml:space="preserve"> </w:t>
+      </w:r>
+      <w:r>
+        <w:t xml:space="preserve">current data snapshot) and weighted citations. Field-weighted citations</w:t>
+      </w:r>
+      <w:r>
+        <w:t xml:space="preserve"> </w:t>
+      </w:r>
+      <w:r>
+        <w:t xml:space="preserve">indicated the number of citations in the last five years. We excluded</w:t>
+      </w:r>
+      <w:r>
+        <w:t xml:space="preserve"> </w:t>
+      </w:r>
+      <w:r>
+        <w:t xml:space="preserve">articles within the last five years for the field-weighted citation</w:t>
+      </w:r>
+      <w:r>
+        <w:t xml:space="preserve"> </w:t>
+      </w:r>
+      <w:r>
+        <w:t xml:space="preserve">counts to ensure consistency for this variable.</w:t>
       </w:r>
     </w:p>
     <w:p>
@@ -2704,8 +2727,8 @@
         <w:t xml:space="preserve">total authors) as a single variable for each article.</w:t>
       </w:r>
     </w:p>
-    <w:bookmarkEnd w:id="25"/>
-    <w:bookmarkStart w:id="26" w:name="sampling-plan"/>
+    <w:bookmarkEnd w:id="27"/>
+    <w:bookmarkStart w:id="28" w:name="sampling-plan"/>
     <w:p>
       <w:pPr>
         <w:pStyle w:val="berschrift3"/>
@@ -2737,49 +2760,49 @@
         <w:t xml:space="preserve"> </w:t>
       </w:r>
       <w:r>
-        <w:t xml:space="preserve">information, which will be required for calculation of several of the</w:t>
-      </w:r>
-      <w:r>
-        <w:t xml:space="preserve"> </w:t>
-      </w:r>
-      <w:r>
-        <w:t xml:space="preserve">variables described above. Only journal articles from this time period</w:t>
-      </w:r>
-      <w:r>
-        <w:t xml:space="preserve"> </w:t>
-      </w:r>
-      <w:r>
-        <w:t xml:space="preserve">will be included sampled at a rate of 25% of eligible articles. We will</w:t>
-      </w:r>
-      <w:r>
-        <w:t xml:space="preserve"> </w:t>
-      </w:r>
-      <w:r>
-        <w:t xml:space="preserve">include the date of analysis to indicate what data was available at the</w:t>
-      </w:r>
-      <w:r>
-        <w:t xml:space="preserve"> </w:t>
-      </w:r>
-      <w:r>
-        <w:t xml:space="preserve">time analysis[^We originally included all articles from 1970 and</w:t>
-      </w:r>
-      <w:r>
-        <w:t xml:space="preserve"> </w:t>
-      </w:r>
-      <w:r>
-        <w:t xml:space="preserve">forward. Due to computational constraints, we randomly sampled 25% of</w:t>
-      </w:r>
-      <w:r>
-        <w:t xml:space="preserve"> </w:t>
-      </w:r>
-      <w:r>
-        <w:t xml:space="preserve">eligible articles during this time span to constrain the run time of our</w:t>
-      </w:r>
-      <w:r>
-        <w:t xml:space="preserve"> </w:t>
-      </w:r>
-      <w:r>
-        <w:t xml:space="preserve">code and memory necessary to calculate</w:t>
+        <w:t xml:space="preserve">information, which will be required to calculate several of the above</w:t>
+      </w:r>
+      <w:r>
+        <w:t xml:space="preserve"> </w:t>
+      </w:r>
+      <w:r>
+        <w:t xml:space="preserve">mentioned variables. Only journal articles from this time period will be</w:t>
+      </w:r>
+      <w:r>
+        <w:t xml:space="preserve"> </w:t>
+      </w:r>
+      <w:r>
+        <w:t xml:space="preserve">included sampled at a rate of 25% of eligible articles. We will include</w:t>
+      </w:r>
+      <w:r>
+        <w:t xml:space="preserve"> </w:t>
+      </w:r>
+      <w:r>
+        <w:t xml:space="preserve">the analysis date to indicate the data available at the time of</w:t>
+      </w:r>
+      <w:r>
+        <w:t xml:space="preserve"> </w:t>
+      </w:r>
+      <w:r>
+        <w:t xml:space="preserve">analysis. We originally included all articles from 1970 and forward. Due</w:t>
+      </w:r>
+      <w:r>
+        <w:t xml:space="preserve"> </w:t>
+      </w:r>
+      <w:r>
+        <w:t xml:space="preserve">to computational constraints, we randomly sampled 25% of eligible</w:t>
+      </w:r>
+      <w:r>
+        <w:t xml:space="preserve"> </w:t>
+      </w:r>
+      <w:r>
+        <w:t xml:space="preserve">articles during this time span to constrain the run time of our code and</w:t>
+      </w:r>
+      <w:r>
+        <w:t xml:space="preserve"> </w:t>
+      </w:r>
+      <w:r>
+        <w:t xml:space="preserve">the memory necessary to calculate</w:t>
       </w:r>
       <w:r>
         <w:t xml:space="preserve"> </w:t>
@@ -2792,13 +2815,13 @@
         <w:t xml:space="preserve">h</w:t>
       </w:r>
       <w:r>
-        <w:t xml:space="preserve">-index. It is important to</w:t>
-      </w:r>
-      <w:r>
-        <w:t xml:space="preserve"> </w:t>
-      </w:r>
-      <w:r>
-        <w:t xml:space="preserve">note that we did</w:t>
+        <w:t xml:space="preserve">-index. It is important to note</w:t>
+      </w:r>
+      <w:r>
+        <w:t xml:space="preserve"> </w:t>
+      </w:r>
+      <w:r>
+        <w:t xml:space="preserve">that we did</w:t>
       </w:r>
       <w:r>
         <w:t xml:space="preserve"> </w:t>
@@ -2827,19 +2850,19 @@
         <w:t xml:space="preserve">h</w:t>
       </w:r>
       <w:r>
-        <w:t xml:space="preserve">-index on the randomly sampled</w:t>
-      </w:r>
-      <w:r>
-        <w:t xml:space="preserve"> </w:t>
-      </w:r>
-      <w:r>
-        <w:t xml:space="preserve">dataset. These values were calculated on the full data and then merged</w:t>
-      </w:r>
-      <w:r>
-        <w:t xml:space="preserve"> </w:t>
-      </w:r>
-      <w:r>
-        <w:t xml:space="preserve">with the randomly sampled data to ensure</w:t>
+        <w:t xml:space="preserve">-index on the randomly sampled dataset.</w:t>
+      </w:r>
+      <w:r>
+        <w:t xml:space="preserve"> </w:t>
+      </w:r>
+      <w:r>
+        <w:t xml:space="preserve">These values were calculated on the full data and then merged with the</w:t>
+      </w:r>
+      <w:r>
+        <w:t xml:space="preserve"> </w:t>
+      </w:r>
+      <w:r>
+        <w:t xml:space="preserve">randomly sampled data to ensure</w:t>
       </w:r>
       <w:r>
         <w:t xml:space="preserve"> </w:t>
@@ -2852,17 +2875,17 @@
         <w:t xml:space="preserve">h</w:t>
       </w:r>
       <w:r>
-        <w:t xml:space="preserve">-indices were appropriate</w:t>
-      </w:r>
-      <w:r>
-        <w:t xml:space="preserve"> </w:t>
-      </w:r>
-      <w:r>
-        <w:t xml:space="preserve">for authors on the randomly sampled data].</w:t>
+        <w:t xml:space="preserve">-indices were appropriate for authors</w:t>
+      </w:r>
+      <w:r>
+        <w:t xml:space="preserve"> </w:t>
+      </w:r>
+      <w:r>
+        <w:t xml:space="preserve">on the randomly sampled data.</w:t>
       </w:r>
     </w:p>
-    <w:bookmarkEnd w:id="26"/>
-    <w:bookmarkStart w:id="27" w:name="power"/>
+    <w:bookmarkEnd w:id="28"/>
+    <w:bookmarkStart w:id="29" w:name="power"/>
     <w:p>
       <w:pPr>
         <w:pStyle w:val="berschrift3"/>
@@ -2948,9 +2971,9 @@
         <w:t xml:space="preserve">confidence interval.</w:t>
       </w:r>
     </w:p>
-    <w:bookmarkEnd w:id="27"/>
-    <w:bookmarkEnd w:id="28"/>
-    <w:bookmarkStart w:id="37" w:name="analysis-plan"/>
+    <w:bookmarkEnd w:id="29"/>
+    <w:bookmarkEnd w:id="30"/>
+    <w:bookmarkStart w:id="39" w:name="analysis-plan"/>
     <w:p>
       <w:pPr>
         <w:pStyle w:val="berschrift2"/>
@@ -2959,7 +2982,7 @@
         <w:t xml:space="preserve">Analysis Plan</w:t>
       </w:r>
     </w:p>
-    <w:bookmarkStart w:id="29" w:name="data-availability"/>
+    <w:bookmarkStart w:id="31" w:name="data-availability"/>
     <w:p>
       <w:pPr>
         <w:pStyle w:val="berschrift3"/>
@@ -3003,17 +3026,17 @@
         <w:t xml:space="preserve"> </w:t>
       </w:r>
       <w:r>
-        <w:t xml:space="preserve">authors of the paper that they will guarantee access to researchers who</w:t>
-      </w:r>
-      <w:r>
-        <w:t xml:space="preserve"> </w:t>
-      </w:r>
-      <w:r>
-        <w:t xml:space="preserve">want to follow up or reproduce our results.</w:t>
+        <w:t xml:space="preserve">paper’s authors that they will guarantee access to researchers who want</w:t>
+      </w:r>
+      <w:r>
+        <w:t xml:space="preserve"> </w:t>
+      </w:r>
+      <w:r>
+        <w:t xml:space="preserve">to follow up or reproduce our results.</w:t>
       </w:r>
     </w:p>
-    <w:bookmarkEnd w:id="29"/>
-    <w:bookmarkStart w:id="33" w:name="code-availability"/>
+    <w:bookmarkEnd w:id="31"/>
+    <w:bookmarkStart w:id="35" w:name="code-availability"/>
     <w:p>
       <w:pPr>
         <w:pStyle w:val="berschrift3"/>
@@ -3039,12 +3062,12 @@
         <w:t xml:space="preserve"> </w:t>
       </w:r>
       <w:r>
-        <w:t xml:space="preserve">is available at</w:t>
-      </w:r>
-      <w:r>
-        <w:t xml:space="preserve"> </w:t>
-      </w:r>
-      <w:hyperlink r:id="rId30">
+        <w:t xml:space="preserve">are available at</w:t>
+      </w:r>
+      <w:r>
+        <w:t xml:space="preserve"> </w:t>
+      </w:r>
+      <w:hyperlink r:id="rId32">
         <w:r>
           <w:rPr>
             <w:rStyle w:val="Hyperlink"/>
@@ -3061,7 +3084,7 @@
       <w:r>
         <w:t xml:space="preserve"> </w:t>
       </w:r>
-      <w:hyperlink r:id="rId31">
+      <w:hyperlink r:id="rId33">
         <w:r>
           <w:rPr>
             <w:rStyle w:val="Hyperlink"/>
@@ -3081,7 +3104,7 @@
       <w:r>
         <w:t xml:space="preserve"> </w:t>
       </w:r>
-      <w:hyperlink r:id="rId32">
+      <w:hyperlink r:id="rId34">
         <w:r>
           <w:rPr>
             <w:rStyle w:val="Hyperlink"/>
@@ -3127,8 +3150,8 @@
         <w:t xml:space="preserve">can be found online as well.</w:t>
       </w:r>
     </w:p>
-    <w:bookmarkEnd w:id="33"/>
-    <w:bookmarkStart w:id="34" w:name="data-screening"/>
+    <w:bookmarkEnd w:id="35"/>
+    <w:bookmarkStart w:id="36" w:name="data-screening"/>
     <w:p>
       <w:pPr>
         <w:pStyle w:val="berschrift3"/>
@@ -3154,13 +3177,13 @@
         <w:t xml:space="preserve"> </w:t>
       </w:r>
       <w:r>
-        <w:t xml:space="preserve">cell counts for each categorical variable in order to collapse small</w:t>
-      </w:r>
-      <w:r>
-        <w:t xml:space="preserve"> </w:t>
-      </w:r>
-      <w:r>
-        <w:t xml:space="preserve">cell sizes (i.e.,</w:t>
+        <w:t xml:space="preserve">cell counts for each categorical variable to collapse small cell sizes</w:t>
+      </w:r>
+      <w:r>
+        <w:t xml:space="preserve"> </w:t>
+      </w:r>
+      <w:r>
+        <w:t xml:space="preserve">(i.e.,</w:t>
       </w:r>
       <w:r>
         <w:t xml:space="preserve"> </w:t>
@@ -3176,13 +3199,13 @@
         <w:t xml:space="preserve"> </w:t>
       </w:r>
       <w:r>
-        <w:t xml:space="preserve">&lt; 5). No articles will be considered an outlier,</w:t>
-      </w:r>
-      <w:r>
-        <w:t xml:space="preserve"> </w:t>
-      </w:r>
-      <w:r>
-        <w:t xml:space="preserve">as all publication data was expected to be part of the population.</w:t>
+        <w:t xml:space="preserve">&lt; 5). No articles will be considered an outlier, as all</w:t>
+      </w:r>
+      <w:r>
+        <w:t xml:space="preserve"> </w:t>
+      </w:r>
+      <w:r>
+        <w:t xml:space="preserve">publication data was expected to be part of the population.</w:t>
       </w:r>
     </w:p>
     <w:p>
@@ -3257,8 +3280,8 @@
         <w:t xml:space="preserve">heteroscedasticity. Please see Appendix A for further details.</w:t>
       </w:r>
     </w:p>
-    <w:bookmarkEnd w:id="34"/>
-    <w:bookmarkStart w:id="35" w:name="decision-criteria"/>
+    <w:bookmarkEnd w:id="36"/>
+    <w:bookmarkStart w:id="37" w:name="decision-criteria"/>
     <w:p>
       <w:pPr>
         <w:pStyle w:val="berschrift3"/>
@@ -3306,19 +3329,19 @@
         <w:t xml:space="preserve"> </w:t>
       </w:r>
       <w:r>
-        <w:t xml:space="preserve">indicate if the effect is non-zero (i.e., confidence interval does not</w:t>
-      </w:r>
-      <w:r>
-        <w:t xml:space="preserve"> </w:t>
-      </w:r>
-      <w:r>
-        <w:t xml:space="preserve">include zero rounded to three decimals). The difference between effects</w:t>
-      </w:r>
-      <w:r>
-        <w:t xml:space="preserve"> </w:t>
-      </w:r>
-      <w:r>
-        <w:t xml:space="preserve">will be determined by examining the confidence intervals of</w:t>
+        <w:t xml:space="preserve">indicate if the effect is non-zero (i.e., the confidence interval does</w:t>
+      </w:r>
+      <w:r>
+        <w:t xml:space="preserve"> </w:t>
+      </w:r>
+      <w:r>
+        <w:t xml:space="preserve">not include zero rounded to three decimals). The difference between</w:t>
+      </w:r>
+      <w:r>
+        <w:t xml:space="preserve"> </w:t>
+      </w:r>
+      <w:r>
+        <w:t xml:space="preserve">effects will be determined by examining the confidence intervals of</w:t>
       </w:r>
       <w:r>
         <w:t xml:space="preserve"> </w:t>
@@ -3341,13 +3364,7 @@
         <w:t xml:space="preserve"> </w:t>
       </w:r>
       <w:r>
-        <w:t xml:space="preserve">to</w:t>
-      </w:r>
-      <w:r>
-        <w:t xml:space="preserve"> </w:t>
-      </w:r>
-      <w:r>
-        <w:t xml:space="preserve">three decimal places calculated with the</w:t>
+        <w:t xml:space="preserve">to three decimal places calculated with the</w:t>
       </w:r>
       <w:r>
         <w:t xml:space="preserve"> </w:t>
@@ -3372,17 +3389,17 @@
         <w:t xml:space="preserve">51</w:t>
       </w:r>
       <w:r>
-        <w:t xml:space="preserve">.</w:t>
-      </w:r>
-      <w:r>
-        <w:t xml:space="preserve"> </w:t>
-      </w:r>
-      <w:r>
-        <w:t xml:space="preserve">If they do not overlap, we will state that they are different.</w:t>
+        <w:t xml:space="preserve">. If they do not overlap, we will state that they are</w:t>
+      </w:r>
+      <w:r>
+        <w:t xml:space="preserve"> </w:t>
+      </w:r>
+      <w:r>
+        <w:t xml:space="preserve">different.</w:t>
       </w:r>
     </w:p>
-    <w:bookmarkEnd w:id="35"/>
-    <w:bookmarkStart w:id="36" w:name="research-questions"/>
+    <w:bookmarkEnd w:id="37"/>
+    <w:bookmarkStart w:id="38" w:name="research-questions"/>
     <w:p>
       <w:pPr>
         <w:pStyle w:val="berschrift3"/>
@@ -3396,7 +3413,7 @@
         <w:pStyle w:val="FirstParagraph"/>
       </w:pPr>
       <w:r>
-        <w:t xml:space="preserve">All analyses will be performed using</w:t>
+        <w:t xml:space="preserve">All analyses were performed using</w:t>
       </w:r>
       <w:r>
         <w:t xml:space="preserve"> </w:t>
@@ -3762,7 +3779,7 @@
         <w:t xml:space="preserve"> </w:t>
       </w:r>
       <w:r>
-        <w:t xml:space="preserve">five year count. We calculated the mean, median, and interquartile range</w:t>
+        <w:t xml:space="preserve">five-year count. We calculated the mean, median, and interquartile range</w:t>
       </w:r>
       <w:r>
         <w:t xml:space="preserve"> </w:t>
@@ -3800,7 +3817,7 @@
         <w:t xml:space="preserve"> </w:t>
       </w:r>
       <w:r>
-        <w:t xml:space="preserve">expected that older articles will potentially have more or different</w:t>
+        <w:t xml:space="preserve">expected that older articles would potentially have more or different</w:t>
       </w:r>
       <w:r>
         <w:t xml:space="preserve"> </w:t>
@@ -3870,7 +3887,7 @@
         <w:t xml:space="preserve"> </w:t>
       </w:r>
       <w:r>
-        <w:t xml:space="preserve">previous research question and add other article metrics to determine</w:t>
+        <w:t xml:space="preserve">previous research question and added other article metrics to determine</w:t>
       </w:r>
       <w:r>
         <w:t xml:space="preserve"> </w:t>
@@ -3882,25 +3899,25 @@
         <w:t xml:space="preserve"> </w:t>
       </w:r>
       <w:r>
-        <w:t xml:space="preserve">has an impact on the metrics variables (non-directional). Each author</w:t>
-      </w:r>
-      <w:r>
-        <w:t xml:space="preserve"> </w:t>
-      </w:r>
-      <w:r>
-        <w:t xml:space="preserve">independent variable will be modeled separately and compared using</w:t>
-      </w:r>
-      <w:r>
-        <w:t xml:space="preserve"> </w:t>
-      </w:r>
-      <w:r>
-        <w:t xml:space="preserve">confidence intervals as described above to determine which variable had</w:t>
-      </w:r>
-      <w:r>
-        <w:t xml:space="preserve"> </w:t>
-      </w:r>
-      <w:r>
-        <w:t xml:space="preserve">the strongest impact on publication metrics.</w:t>
+        <w:t xml:space="preserve">impacts the metrics variables (non-directional). Each author independent</w:t>
+      </w:r>
+      <w:r>
+        <w:t xml:space="preserve"> </w:t>
+      </w:r>
+      <w:r>
+        <w:t xml:space="preserve">variable will be modeled separately and compared using confidence</w:t>
+      </w:r>
+      <w:r>
+        <w:t xml:space="preserve"> </w:t>
+      </w:r>
+      <w:r>
+        <w:t xml:space="preserve">intervals as described above to determine which variable had the</w:t>
+      </w:r>
+      <w:r>
+        <w:t xml:space="preserve"> </w:t>
+      </w:r>
+      <w:r>
+        <w:t xml:space="preserve">strongest impact on publication metrics.</w:t>
       </w:r>
     </w:p>
     <w:p>
@@ -3945,7 +3962,13 @@
         <w:t xml:space="preserve"> </w:t>
       </w:r>
       <w:r>
-        <w:t xml:space="preserve">determined if these slopes were important by examining if their confidence interval was greater than zero. We examined the effects of</w:t>
+        <w:t xml:space="preserve">determined if these slopes were important by examining if their</w:t>
+      </w:r>
+      <w:r>
+        <w:t xml:space="preserve"> </w:t>
+      </w:r>
+      <w:r>
+        <w:t xml:space="preserve">confidence interval was greater than zero. We examined the effects of</w:t>
       </w:r>
       <w:r>
         <w:t xml:space="preserve"> </w:t>
@@ -3957,37 +3980,43 @@
         <w:t xml:space="preserve"> </w:t>
       </w:r>
       <w:r>
-        <w:t xml:space="preserve">information, the single author paper presents a unique problem because they are both first and last authors. Therefore, these cannot be included</w:t>
-      </w:r>
-      <w:r>
-        <w:t xml:space="preserve"> </w:t>
-      </w:r>
-      <w:r>
-        <w:t xml:space="preserve">in the same model. In order not to use the same variance twice, single</w:t>
-      </w:r>
-      <w:r>
-        <w:t xml:space="preserve"> </w:t>
-      </w:r>
-      <w:r>
-        <w:t xml:space="preserve">author papers will be treated as first author only, and missing data for</w:t>
-      </w:r>
-      <w:r>
-        <w:t xml:space="preserve"> </w:t>
-      </w:r>
-      <w:r>
-        <w:t xml:space="preserve">last author analyses. If these were included in the same model, all</w:t>
-      </w:r>
-      <w:r>
-        <w:t xml:space="preserve"> </w:t>
-      </w:r>
-      <w:r>
-        <w:t xml:space="preserve">single author papers would be dropped, which would bias the results. We</w:t>
-      </w:r>
-      <w:r>
-        <w:t xml:space="preserve"> </w:t>
-      </w:r>
-      <w:r>
-        <w:t xml:space="preserve">will then compare each overall</w:t>
+        <w:t xml:space="preserve">information, the single author paper presents a unique problem because</w:t>
+      </w:r>
+      <w:r>
+        <w:t xml:space="preserve"> </w:t>
+      </w:r>
+      <w:r>
+        <w:t xml:space="preserve">they are both first and last authors. Therefore, these cannot be</w:t>
+      </w:r>
+      <w:r>
+        <w:t xml:space="preserve"> </w:t>
+      </w:r>
+      <w:r>
+        <w:t xml:space="preserve">included in the same model. In order not to use the same variance twice,</w:t>
+      </w:r>
+      <w:r>
+        <w:t xml:space="preserve"> </w:t>
+      </w:r>
+      <w:r>
+        <w:t xml:space="preserve">single author papers will be treated as first author only, and missing</w:t>
+      </w:r>
+      <w:r>
+        <w:t xml:space="preserve"> </w:t>
+      </w:r>
+      <w:r>
+        <w:t xml:space="preserve">data for last author analyses. If these were included in the same model,</w:t>
+      </w:r>
+      <w:r>
+        <w:t xml:space="preserve"> </w:t>
+      </w:r>
+      <w:r>
+        <w:t xml:space="preserve">all single author papers would be dropped, which would bias the results.</w:t>
+      </w:r>
+      <w:r>
+        <w:t xml:space="preserve"> </w:t>
+      </w:r>
+      <w:r>
+        <w:t xml:space="preserve">We will then compare each overall</w:t>
       </w:r>
       <w:r>
         <w:t xml:space="preserve"> </w:t>
@@ -4072,10 +4101,10 @@
         <w:t xml:space="preserve">intervals for each variable.</w:t>
       </w:r>
     </w:p>
-    <w:bookmarkEnd w:id="36"/>
-    <w:bookmarkEnd w:id="37"/>
     <w:bookmarkEnd w:id="38"/>
-    <w:bookmarkStart w:id="71" w:name="results"/>
+    <w:bookmarkEnd w:id="39"/>
+    <w:bookmarkEnd w:id="40"/>
+    <w:bookmarkStart w:id="73" w:name="results"/>
     <w:p>
       <w:pPr>
         <w:pStyle w:val="berschrift1"/>
@@ -4084,7 +4113,7 @@
         <w:t xml:space="preserve">Results</w:t>
       </w:r>
     </w:p>
-    <w:bookmarkStart w:id="45" w:name="X43cbcdd92585f5beedef3cbbfadb36b8e09bb66"/>
+    <w:bookmarkStart w:id="47" w:name="X43cbcdd92585f5beedef3cbbfadb36b8e09bb66"/>
     <w:p>
       <w:pPr>
         <w:pStyle w:val="berschrift2"/>
@@ -4093,7 +4122,7 @@
         <w:t xml:space="preserve">Research Question 1a: What is the pattern of team size distribution within various disciplines over time?</w:t>
       </w:r>
     </w:p>
-    <w:bookmarkStart w:id="43" w:name="descriptive-statistics"/>
+    <w:bookmarkStart w:id="45" w:name="descriptive-statistics"/>
     <w:p>
       <w:pPr>
         <w:pStyle w:val="berschrift3"/>
@@ -4131,25 +4160,25 @@
         <w:t xml:space="preserve"> </w:t>
       </w:r>
       <w:r>
-        <w:t xml:space="preserve">generally five to six authors with the exception of the social sciences</w:t>
-      </w:r>
-      <w:r>
-        <w:t xml:space="preserve"> </w:t>
-      </w:r>
-      <w:r>
-        <w:t xml:space="preserve">with a median of three authors per manuscript. Mean values were</w:t>
-      </w:r>
-      <w:r>
-        <w:t xml:space="preserve"> </w:t>
-      </w:r>
-      <w:r>
-        <w:t xml:space="preserve">generally from four to nine authors with the most variability in team</w:t>
-      </w:r>
-      <w:r>
-        <w:t xml:space="preserve"> </w:t>
-      </w:r>
-      <w:r>
-        <w:t xml:space="preserve">size for the physical sciences.</w:t>
+        <w:t xml:space="preserve">generally five to six authors, except for the social sciences, which had</w:t>
+      </w:r>
+      <w:r>
+        <w:t xml:space="preserve"> </w:t>
+      </w:r>
+      <w:r>
+        <w:t xml:space="preserve">a median of three authors per manuscript. Mean values were generally</w:t>
+      </w:r>
+      <w:r>
+        <w:t xml:space="preserve"> </w:t>
+      </w:r>
+      <w:r>
+        <w:t xml:space="preserve">from four to nine authors, with the most variability in team size for</w:t>
+      </w:r>
+      <w:r>
+        <w:t xml:space="preserve"> </w:t>
+      </w:r>
+      <w:r>
+        <w:t xml:space="preserve">the physical sciences.</w:t>
       </w:r>
     </w:p>
     <w:p>
@@ -4161,18 +4190,18 @@
           <wp:inline>
             <wp:extent cx="5969000" cy="3581400"/>
             <wp:effectExtent b="0" l="0" r="0" t="0"/>
-            <wp:docPr descr="Figure 1: Boxplot of team size by subject areas. The boxplot represents the median (middle bar), the interquartile range (box), and the mean (dot) for each subject area. The plot was capped at 15 for visualization purposes. The size of the mean point represents the sample size of the number of articles used within the calculation. The size of the box represents the standard deviation of the mean for team size (i.e., larger boxes indicate more variance in the team size)." title="" id="40" name="Picture"/>
+            <wp:docPr descr="Figure 1: Boxplot of team size by subject areas. The boxplot represents the median (middle bar), the interquartile range (box), and the mean (dot) for each subject area. The plot was capped at 15 for visualization purposes. The size of the mean point represents the sample size of the number of articles used within the calculation. The size of the box represents the standard deviation of the mean for team size (i.e., larger boxes indicate more variance in the team size)." title="" id="42" name="Picture"/>
             <a:graphic>
               <a:graphicData uri="http://schemas.openxmlformats.org/drawingml/2006/picture">
                 <pic:pic>
                   <pic:nvPicPr>
-                    <pic:cNvPr descr="manuscript_files/figure-docx/fig-desc-r1-1.png" id="41" name="Picture"/>
+                    <pic:cNvPr descr="manuscript_files/figure-docx/fig-desc-r1-1.png" id="43" name="Picture"/>
                     <pic:cNvPicPr>
                       <a:picLocks noChangeArrowheads="1" noChangeAspect="1"/>
                     </pic:cNvPicPr>
                   </pic:nvPicPr>
                   <pic:blipFill>
-                    <a:blip r:embed="rId39"/>
+                    <a:blip r:embed="rId41"/>
                     <a:stretch>
                       <a:fillRect/>
                     </a:stretch>
@@ -4203,8 +4232,8 @@
       <w:pPr>
         <w:pStyle w:val="ImageCaption"/>
       </w:pPr>
-      <w:bookmarkStart w:id="42" w:name="fig:fig-desc-r1"/>
-      <w:bookmarkEnd w:id="42"/>
+      <w:bookmarkStart w:id="44" w:name="fig:fig-desc-r1"/>
+      <w:bookmarkEnd w:id="44"/>
       <w:r>
         <w:rPr>
           <w:i/>
@@ -4219,8 +4248,8 @@
         <w:t xml:space="preserve">1. Boxplot of team size by subject areas. The boxplot represents the median (middle bar), the interquartile range (box), and the mean (dot) for each subject area. The plot was capped at 15 for visualization purposes. The size of the mean point represents the sample size of the number of articles used within the calculation. The size of the box represents the standard deviation of the mean for team size (i.e., larger boxes indicate more variance in the team size).</w:t>
       </w:r>
     </w:p>
-    <w:bookmarkEnd w:id="43"/>
-    <w:bookmarkStart w:id="44" w:name="model-statistics"/>
+    <w:bookmarkEnd w:id="45"/>
+    <w:bookmarkStart w:id="46" w:name="model-statistics"/>
     <w:p>
       <w:pPr>
         <w:pStyle w:val="berschrift3"/>
@@ -4325,9 +4354,9 @@
         <w:t xml:space="preserve">presented with their 95% confidence interval in Appendix A.</w:t>
       </w:r>
     </w:p>
-    <w:bookmarkEnd w:id="44"/>
-    <w:bookmarkEnd w:id="45"/>
-    <w:bookmarkStart w:id="56" w:name="Xcc699305f51f7e2f9b3ef62a6dfe3f75d3e6921"/>
+    <w:bookmarkEnd w:id="46"/>
+    <w:bookmarkEnd w:id="47"/>
+    <w:bookmarkStart w:id="58" w:name="Xcc699305f51f7e2f9b3ef62a6dfe3f75d3e6921"/>
     <w:p>
       <w:pPr>
         <w:pStyle w:val="berschrift2"/>
@@ -4336,7 +4365,7 @@
         <w:t xml:space="preserve">Research Question 1b: Is team size related to article impact?</w:t>
       </w:r>
     </w:p>
-    <w:bookmarkStart w:id="50" w:name="descriptive-statistics-citation-count"/>
+    <w:bookmarkStart w:id="52" w:name="descriptive-statistics-citation-count"/>
     <w:p>
       <w:pPr>
         <w:pStyle w:val="berschrift3"/>
@@ -4368,7 +4397,7 @@
         <w:t xml:space="preserve"> </w:t>
       </w:r>
       <w:r>
-        <w:t xml:space="preserve">median, and interquartile range for the citation counts and five year</w:t>
+        <w:t xml:space="preserve">median, and interquartile range for the citation counts and five-year</w:t>
       </w:r>
       <w:r>
         <w:t xml:space="preserve"> </w:t>
@@ -4392,7 +4421,7 @@
         <w:t xml:space="preserve"> </w:t>
       </w:r>
       <w:r>
-        <w:t xml:space="preserve">similar for both overall citation counts and five year citation counts.</w:t>
+        <w:t xml:space="preserve">similar for both overall citation counts and five-year citation counts.</w:t>
       </w:r>
     </w:p>
     <w:p>
@@ -4404,18 +4433,18 @@
           <wp:inline>
             <wp:extent cx="5969000" cy="3581400"/>
             <wp:effectExtent b="0" l="0" r="0" t="0"/>
-            <wp:docPr descr="Figure 2: Boxplot of citation counts by subject area. The boxplot represents the median (middle bar), the interquartile range (box), and the mean (dot) for overall citations and five year citation count. The plot was capped at 60 citations for visualization purposes. The size of the mean point represents the sample size of the number of articles used within the calculation. The size of the box represents the standard deviation of the mean for citation count (i.e., larger boxes indicate more variance in the citation counts)." title="" id="47" name="Picture"/>
+            <wp:docPr descr="Figure 2: Boxplot of citation counts by subject area. The boxplot represents the median (middle bar), the interquartile range (box), and the mean (dot) for overall citations and five year citation count. The plot was capped at 60 citations for visualization purposes. The size of the mean point represents the sample size of the number of articles used within the calculation. The size of the box represents the standard deviation of the mean for citation count (i.e., larger boxes indicate more variance in the citation counts)." title="" id="49" name="Picture"/>
             <a:graphic>
               <a:graphicData uri="http://schemas.openxmlformats.org/drawingml/2006/picture">
                 <pic:pic>
                   <pic:nvPicPr>
-                    <pic:cNvPr descr="manuscript_files/figure-docx/fig-desc-r1b-1.png" id="48" name="Picture"/>
+                    <pic:cNvPr descr="manuscript_files/figure-docx/fig-desc-r1b-1.png" id="50" name="Picture"/>
                     <pic:cNvPicPr>
                       <a:picLocks noChangeArrowheads="1" noChangeAspect="1"/>
                     </pic:cNvPicPr>
                   </pic:nvPicPr>
                   <pic:blipFill>
-                    <a:blip r:embed="rId46"/>
+                    <a:blip r:embed="rId48"/>
                     <a:stretch>
                       <a:fillRect/>
                     </a:stretch>
@@ -4446,8 +4475,8 @@
       <w:pPr>
         <w:pStyle w:val="ImageCaption"/>
       </w:pPr>
-      <w:bookmarkStart w:id="49" w:name="fig:fig-desc-r1b"/>
-      <w:bookmarkEnd w:id="49"/>
+      <w:bookmarkStart w:id="51" w:name="fig:fig-desc-r1b"/>
+      <w:bookmarkEnd w:id="51"/>
       <w:r>
         <w:rPr>
           <w:i/>
@@ -4462,8 +4491,8 @@
         <w:t xml:space="preserve">2. Boxplot of citation counts by subject area. The boxplot represents the median (middle bar), the interquartile range (box), and the mean (dot) for overall citations and five year citation count. The plot was capped at 60 citations for visualization purposes. The size of the mean point represents the sample size of the number of articles used within the calculation. The size of the box represents the standard deviation of the mean for citation count (i.e., larger boxes indicate more variance in the citation counts).</w:t>
       </w:r>
     </w:p>
-    <w:bookmarkEnd w:id="50"/>
-    <w:bookmarkStart w:id="55" w:name="model-statistics-1"/>
+    <w:bookmarkEnd w:id="52"/>
+    <w:bookmarkStart w:id="57" w:name="model-statistics-1"/>
     <w:p>
       <w:pPr>
         <w:pStyle w:val="berschrift3"/>
@@ -4599,37 +4628,43 @@
         <w:t xml:space="preserve"> </w:t>
       </w:r>
       <w:r>
-        <w:t xml:space="preserve">area showed a coefficient greater than zero, but overall effect size for</w:t>
-      </w:r>
-      <w:r>
-        <w:t xml:space="preserve"> </w:t>
-      </w:r>
-      <w:r>
-        <w:t xml:space="preserve">the physical sciences was not different from zero. Multidisciplinary and</w:t>
-      </w:r>
-      <w:r>
-        <w:t xml:space="preserve"> </w:t>
-      </w:r>
-      <w:r>
-        <w:t xml:space="preserve">social sciences showed the largest effects and coefficients followed by</w:t>
-      </w:r>
-      <w:r>
-        <w:t xml:space="preserve"> </w:t>
-      </w:r>
-      <w:r>
-        <w:t xml:space="preserve">life and health sciences. Each additional team member could represent up</w:t>
-      </w:r>
-      <w:r>
-        <w:t xml:space="preserve"> </w:t>
-      </w:r>
-      <w:r>
-        <w:t xml:space="preserve">to two extra citations for research manuscripts. The coefficients are</w:t>
-      </w:r>
-      <w:r>
-        <w:t xml:space="preserve"> </w:t>
-      </w:r>
-      <w:r>
-        <w:t xml:space="preserve">presented with their 95% confidence interval in Appendix A.</w:t>
+        <w:t xml:space="preserve">area showed a coefficient greater than zero, but the overall effect size</w:t>
+      </w:r>
+      <w:r>
+        <w:t xml:space="preserve"> </w:t>
+      </w:r>
+      <w:r>
+        <w:t xml:space="preserve">for the physical sciences was not different from zero. Multidisciplinary</w:t>
+      </w:r>
+      <w:r>
+        <w:t xml:space="preserve"> </w:t>
+      </w:r>
+      <w:r>
+        <w:t xml:space="preserve">and social sciences showed the largest effects and coefficients,</w:t>
+      </w:r>
+      <w:r>
+        <w:t xml:space="preserve"> </w:t>
+      </w:r>
+      <w:r>
+        <w:t xml:space="preserve">followed by life and health sciences. Each additional team member could</w:t>
+      </w:r>
+      <w:r>
+        <w:t xml:space="preserve"> </w:t>
+      </w:r>
+      <w:r>
+        <w:t xml:space="preserve">represent up to two extra citations for research manuscripts. The</w:t>
+      </w:r>
+      <w:r>
+        <w:t xml:space="preserve"> </w:t>
+      </w:r>
+      <w:r>
+        <w:t xml:space="preserve">coefficients are presented with their 95% confidence interval in</w:t>
+      </w:r>
+      <w:r>
+        <w:t xml:space="preserve"> </w:t>
+      </w:r>
+      <w:r>
+        <w:t xml:space="preserve">Appendix A.</w:t>
       </w:r>
     </w:p>
     <w:p>
@@ -4641,18 +4676,18 @@
           <wp:inline>
             <wp:extent cx="5969000" cy="3581400"/>
             <wp:effectExtent b="0" l="0" r="0" t="0"/>
-            <wp:docPr descr="Figure 3: Heatmap of results for coefficients of team size predicting year (top), and team size predicting citation counts while controlling for year (bottom). The effect sizes are also presented for comparison across subject areas." title="" id="52" name="Picture"/>
+            <wp:docPr descr="Figure 3: Heatmap of results for coefficients of team size predicting year (top), and team size predicting citation counts while controlling for year (bottom). The effect sizes are also presented for comparison across subject areas." title="" id="54" name="Picture"/>
             <a:graphic>
               <a:graphicData uri="http://schemas.openxmlformats.org/drawingml/2006/picture">
                 <pic:pic>
                   <pic:nvPicPr>
-                    <pic:cNvPr descr="manuscript_files/figure-docx/fig-heatmap-1.png" id="53" name="Picture"/>
+                    <pic:cNvPr descr="manuscript_files/figure-docx/fig-heatmap-1.png" id="55" name="Picture"/>
                     <pic:cNvPicPr>
                       <a:picLocks noChangeArrowheads="1" noChangeAspect="1"/>
                     </pic:cNvPicPr>
                   </pic:nvPicPr>
                   <pic:blipFill>
-                    <a:blip r:embed="rId51"/>
+                    <a:blip r:embed="rId53"/>
                     <a:stretch>
                       <a:fillRect/>
                     </a:stretch>
@@ -4683,8 +4718,8 @@
       <w:pPr>
         <w:pStyle w:val="ImageCaption"/>
       </w:pPr>
-      <w:bookmarkStart w:id="54" w:name="fig:fig-heatmap"/>
-      <w:bookmarkEnd w:id="54"/>
+      <w:bookmarkStart w:id="56" w:name="fig:fig-heatmap"/>
+      <w:bookmarkEnd w:id="56"/>
       <w:r>
         <w:rPr>
           <w:i/>
@@ -4699,9 +4734,9 @@
         <w:t xml:space="preserve">3. Heatmap of results for coefficients of team size predicting year (top), and team size predicting citation counts while controlling for year (bottom). The effect sizes are also presented for comparison across subject areas.</w:t>
       </w:r>
     </w:p>
-    <w:bookmarkEnd w:id="55"/>
-    <w:bookmarkEnd w:id="56"/>
-    <w:bookmarkStart w:id="70" w:name="Xb925d016481f3584614775a361dc93f895c4104"/>
+    <w:bookmarkEnd w:id="57"/>
+    <w:bookmarkEnd w:id="58"/>
+    <w:bookmarkStart w:id="72" w:name="Xb925d016481f3584614775a361dc93f895c4104"/>
     <w:p>
       <w:pPr>
         <w:pStyle w:val="berschrift2"/>
@@ -4710,7 +4745,7 @@
         <w:t xml:space="preserve">Research Question 2: What characteristics of team composition have the greatest influence on article metrics?</w:t>
       </w:r>
     </w:p>
-    <w:bookmarkStart w:id="69" w:name="model-statistics-overall"/>
+    <w:bookmarkStart w:id="71" w:name="model-statistics-overall"/>
     <w:p>
       <w:pPr>
         <w:pStyle w:val="berschrift3"/>
@@ -4730,7 +4765,7 @@
         <w:t xml:space="preserve"> </w:t>
       </w:r>
       <w:r>
-        <w:t xml:space="preserve">year predicting citation counts and five year citation counts. Appendix</w:t>
+        <w:t xml:space="preserve">year predicting citation counts and five-year citation counts. Appendix</w:t>
       </w:r>
       <w:r>
         <w:t xml:space="preserve"> </w:t>
@@ -4772,7 +4807,7 @@
         <w:t xml:space="preserve"> </w:t>
       </w:r>
       <w:r>
-        <w:t xml:space="preserve">different from zero. In general, all effects were positive with one</w:t>
+        <w:t xml:space="preserve">different from zero. In general, all effects were positive, with one</w:t>
       </w:r>
       <w:r>
         <w:t xml:space="preserve"> </w:t>
@@ -4879,7 +4914,7 @@
         <w:t xml:space="preserve"> </w:t>
       </w:r>
       <w:r>
-        <w:t xml:space="preserve">explaining five year citation rates.</w:t>
+        <w:t xml:space="preserve">explaining five-year citation rates.</w:t>
       </w:r>
     </w:p>
     <w:p>
@@ -4891,18 +4926,18 @@
           <wp:inline>
             <wp:extent cx="5969000" cy="4775200"/>
             <wp:effectExtent b="0" l="0" r="0" t="0"/>
-            <wp:docPr descr="Figure 4: Author variable coefficients (top) and effect sizes (bottom) predicting citation counts and five year citation counts. 95% confidence intervals are displayed but are very narrow due to large sample size. Appendix A includes all exact values for reference." title="" id="58" name="Picture"/>
+            <wp:docPr descr="Figure 4: Author variable coefficients (top) and effect sizes (bottom) predicting citation counts and five year citation counts. 95% confidence intervals are displayed but are very narrow due to large sample size. Appendix A includes all exact values for reference." title="" id="60" name="Picture"/>
             <a:graphic>
               <a:graphicData uri="http://schemas.openxmlformats.org/drawingml/2006/picture">
                 <pic:pic>
                   <pic:nvPicPr>
-                    <pic:cNvPr descr="manuscript_files/figure-docx/fig-hyp2-1.png" id="59" name="Picture"/>
+                    <pic:cNvPr descr="manuscript_files/figure-docx/fig-hyp2-1.png" id="61" name="Picture"/>
                     <pic:cNvPicPr>
                       <a:picLocks noChangeArrowheads="1" noChangeAspect="1"/>
                     </pic:cNvPicPr>
                   </pic:nvPicPr>
                   <pic:blipFill>
-                    <a:blip r:embed="rId57"/>
+                    <a:blip r:embed="rId59"/>
                     <a:stretch>
                       <a:fillRect/>
                     </a:stretch>
@@ -4933,8 +4968,8 @@
       <w:pPr>
         <w:pStyle w:val="ImageCaption"/>
       </w:pPr>
-      <w:bookmarkStart w:id="60" w:name="fig:fig-hyp2"/>
-      <w:bookmarkEnd w:id="60"/>
+      <w:bookmarkStart w:id="62" w:name="fig:fig-hyp2"/>
+      <w:bookmarkEnd w:id="62"/>
       <w:r>
         <w:rPr>
           <w:i/>
@@ -5076,7 +5111,7 @@
         <w:t xml:space="preserve"> </w:t>
       </w:r>
       <w:r>
-        <w:t xml:space="preserve">papers receive more citations with a female author in last place, while</w:t>
+        <w:t xml:space="preserve">papers receive more citations, with a female author in last place, while</w:t>
       </w:r>
       <w:r>
         <w:t xml:space="preserve"> </w:t>
@@ -5088,55 +5123,61 @@
         <w:t xml:space="preserve"> </w:t>
       </w:r>
       <w:r>
-        <w:t xml:space="preserve">gender comparisons are positive, resulting in male authored papers</w:t>
-      </w:r>
-      <w:r>
-        <w:t xml:space="preserve"> </w:t>
-      </w:r>
-      <w:r>
-        <w:t xml:space="preserve">receiving more citations. Gender percentage also split between negative</w:t>
-      </w:r>
-      <w:r>
-        <w:t xml:space="preserve"> </w:t>
-      </w:r>
-      <w:r>
-        <w:t xml:space="preserve">and positive coefficients. The social sciences largely drive this</w:t>
-      </w:r>
-      <w:r>
-        <w:t xml:space="preserve"> </w:t>
-      </w:r>
-      <w:r>
-        <w:t xml:space="preserve">effect, wherein papers with larger proportions of male authors receive</w:t>
-      </w:r>
-      <w:r>
-        <w:t xml:space="preserve"> </w:t>
-      </w:r>
-      <w:r>
-        <w:t xml:space="preserve">significantly less citations. Health sciences also included negative</w:t>
-      </w:r>
-      <w:r>
-        <w:t xml:space="preserve"> </w:t>
-      </w:r>
-      <w:r>
-        <w:t xml:space="preserve">gender percent predictions. Interestingly, the physical sciences showed</w:t>
-      </w:r>
-      <w:r>
-        <w:t xml:space="preserve"> </w:t>
-      </w:r>
-      <w:r>
-        <w:t xml:space="preserve">a negative effect for the proportion of males on five year citation</w:t>
-      </w:r>
-      <w:r>
-        <w:t xml:space="preserve"> </w:t>
-      </w:r>
-      <w:r>
-        <w:t xml:space="preserve">rates, but a positive effect on overall citation rates. The life</w:t>
-      </w:r>
-      <w:r>
-        <w:t xml:space="preserve"> </w:t>
-      </w:r>
-      <w:r>
-        <w:t xml:space="preserve">sciences and multidisciplinary subject areas were both positive effects.</w:t>
+        <w:t xml:space="preserve">gender comparisons are positive, resulting in male-authored papers</w:t>
+      </w:r>
+      <w:r>
+        <w:t xml:space="preserve"> </w:t>
+      </w:r>
+      <w:r>
+        <w:t xml:space="preserve">receiving more citations. Gender percentage is also split between</w:t>
+      </w:r>
+      <w:r>
+        <w:t xml:space="preserve"> </w:t>
+      </w:r>
+      <w:r>
+        <w:t xml:space="preserve">negative and positive coefficients. The social sciences largely drive</w:t>
+      </w:r>
+      <w:r>
+        <w:t xml:space="preserve"> </w:t>
+      </w:r>
+      <w:r>
+        <w:t xml:space="preserve">this effect, wherein papers with larger proportions of male authors</w:t>
+      </w:r>
+      <w:r>
+        <w:t xml:space="preserve"> </w:t>
+      </w:r>
+      <w:r>
+        <w:t xml:space="preserve">receive significantly fewer citations. Health sciences also included</w:t>
+      </w:r>
+      <w:r>
+        <w:t xml:space="preserve"> </w:t>
+      </w:r>
+      <w:r>
+        <w:t xml:space="preserve">negative gender percent predictions. Interestingly, the physical</w:t>
+      </w:r>
+      <w:r>
+        <w:t xml:space="preserve"> </w:t>
+      </w:r>
+      <w:r>
+        <w:t xml:space="preserve">sciences showed a negative effect for the proportion of males on</w:t>
+      </w:r>
+      <w:r>
+        <w:t xml:space="preserve"> </w:t>
+      </w:r>
+      <w:r>
+        <w:t xml:space="preserve">five-year citation rates, but a positive effect on overall citation</w:t>
+      </w:r>
+      <w:r>
+        <w:t xml:space="preserve"> </w:t>
+      </w:r>
+      <w:r>
+        <w:t xml:space="preserve">rates. The life sciences and multidisciplinary subject areas were both</w:t>
+      </w:r>
+      <w:r>
+        <w:t xml:space="preserve"> </w:t>
+      </w:r>
+      <w:r>
+        <w:t xml:space="preserve">positive effects.</w:t>
       </w:r>
     </w:p>
     <w:p>
@@ -5163,13 +5204,13 @@
         <w:t xml:space="preserve"> </w:t>
       </w:r>
       <w:r>
-        <w:t xml:space="preserve">the overall citations than the five year citation counts; however, the</w:t>
-      </w:r>
-      <w:r>
-        <w:t xml:space="preserve"> </w:t>
-      </w:r>
-      <w:r>
-        <w:t xml:space="preserve">effect sizes were again always larger for five year citation models than</w:t>
+        <w:t xml:space="preserve">the overall citations than the five-year citation counts; however, the</w:t>
+      </w:r>
+      <w:r>
+        <w:t xml:space="preserve"> </w:t>
+      </w:r>
+      <w:r>
+        <w:t xml:space="preserve">effect sizes were again always larger for five-year citation models than</w:t>
       </w:r>
       <w:r>
         <w:t xml:space="preserve"> </w:t>
@@ -5252,7 +5293,7 @@
         <w:t xml:space="preserve"> </w:t>
       </w:r>
       <w:r>
-        <w:t xml:space="preserve">citations, but again, the effect sizes were often larger for five year</w:t>
+        <w:t xml:space="preserve">citations, but again, the effect sizes were often larger for five-year</w:t>
       </w:r>
       <w:r>
         <w:t xml:space="preserve"> </w:t>
@@ -5270,18 +5311,18 @@
           <wp:inline>
             <wp:extent cx="5969000" cy="4775200"/>
             <wp:effectExtent b="0" l="0" r="0" t="0"/>
-            <wp:docPr descr="Figure 5: Author variable coefficients predicting citation counts and five year citation counts separated by subject area. 95% confidence intervals are displayed but are very narrow due to large sample size. Appendix A includes all exact values for reference." title="" id="62" name="Picture"/>
+            <wp:docPr descr="Figure 5: Author variable coefficients predicting citation counts and five year citation counts separated by subject area. 95% confidence intervals are displayed but are very narrow due to large sample size. Appendix A includes all exact values for reference." title="" id="64" name="Picture"/>
             <a:graphic>
               <a:graphicData uri="http://schemas.openxmlformats.org/drawingml/2006/picture">
                 <pic:pic>
                   <pic:nvPicPr>
-                    <pic:cNvPr descr="manuscript_files/figure-docx/fig-hyp2-effect-1.png" id="63" name="Picture"/>
+                    <pic:cNvPr descr="manuscript_files/figure-docx/fig-hyp2-effect-1.png" id="65" name="Picture"/>
                     <pic:cNvPicPr>
                       <a:picLocks noChangeArrowheads="1" noChangeAspect="1"/>
                     </pic:cNvPicPr>
                   </pic:nvPicPr>
                   <pic:blipFill>
-                    <a:blip r:embed="rId61"/>
+                    <a:blip r:embed="rId63"/>
                     <a:stretch>
                       <a:fillRect/>
                     </a:stretch>
@@ -5312,8 +5353,8 @@
       <w:pPr>
         <w:pStyle w:val="ImageCaption"/>
       </w:pPr>
-      <w:bookmarkStart w:id="64" w:name="fig:fig-hyp2-effect"/>
-      <w:bookmarkEnd w:id="64"/>
+      <w:bookmarkStart w:id="66" w:name="fig:fig-hyp2-effect"/>
+      <w:bookmarkEnd w:id="66"/>
       <w:r>
         <w:rPr>
           <w:i/>
@@ -5337,18 +5378,18 @@
           <wp:inline>
             <wp:extent cx="5969000" cy="4775200"/>
             <wp:effectExtent b="0" l="0" r="0" t="0"/>
-            <wp:docPr descr="Figure 6: Author variable coefficients predicting citation counts and five year citation counts separated by subject area. 95% confidence intervals are displayed but are very narrow due to large sample size. Appendix A includes all exact values for reference." title="" id="66" name="Picture"/>
+            <wp:docPr descr="Figure 6: Author variable coefficients predicting citation counts and five year citation counts separated by subject area. 95% confidence intervals are displayed but are very narrow due to large sample size. Appendix A includes all exact values for reference." title="" id="68" name="Picture"/>
             <a:graphic>
               <a:graphicData uri="http://schemas.openxmlformats.org/drawingml/2006/picture">
                 <pic:pic>
                   <pic:nvPicPr>
-                    <pic:cNvPr descr="manuscript_files/figure-docx/fig-hyp2-coef-1.png" id="67" name="Picture"/>
+                    <pic:cNvPr descr="manuscript_files/figure-docx/fig-hyp2-coef-1.png" id="69" name="Picture"/>
                     <pic:cNvPicPr>
                       <a:picLocks noChangeArrowheads="1" noChangeAspect="1"/>
                     </pic:cNvPicPr>
                   </pic:nvPicPr>
                   <pic:blipFill>
-                    <a:blip r:embed="rId65"/>
+                    <a:blip r:embed="rId67"/>
                     <a:stretch>
                       <a:fillRect/>
                     </a:stretch>
@@ -5379,8 +5420,8 @@
       <w:pPr>
         <w:pStyle w:val="ImageCaption"/>
       </w:pPr>
-      <w:bookmarkStart w:id="68" w:name="fig:fig-hyp2-coef"/>
-      <w:bookmarkEnd w:id="68"/>
+      <w:bookmarkStart w:id="70" w:name="fig:fig-hyp2-coef"/>
+      <w:bookmarkEnd w:id="70"/>
       <w:r>
         <w:rPr>
           <w:i/>
@@ -5395,10 +5436,10 @@
         <w:t xml:space="preserve">6. Author variable coefficients predicting citation counts and five year citation counts separated by subject area. 95% confidence intervals are displayed but are very narrow due to large sample size. Appendix A includes all exact values for reference.</w:t>
       </w:r>
     </w:p>
-    <w:bookmarkEnd w:id="69"/>
-    <w:bookmarkEnd w:id="70"/>
     <w:bookmarkEnd w:id="71"/>
-    <w:bookmarkStart w:id="78" w:name="discussion"/>
+    <w:bookmarkEnd w:id="72"/>
+    <w:bookmarkEnd w:id="73"/>
+    <w:bookmarkStart w:id="80" w:name="discussion"/>
     <w:p>
       <w:pPr>
         <w:pStyle w:val="berschrift1"/>
@@ -5407,7 +5448,7 @@
         <w:t xml:space="preserve">Discussion</w:t>
       </w:r>
     </w:p>
-    <w:bookmarkStart w:id="72" w:name="Xab48321c099d1574689a1b99cb29bb1b299a989"/>
+    <w:bookmarkStart w:id="74" w:name="Xab48321c099d1574689a1b99cb29bb1b299a989"/>
     <w:p>
       <w:pPr>
         <w:pStyle w:val="berschrift2"/>
@@ -5529,7 +5570,7 @@
         <w:pStyle w:val="Textkrper"/>
       </w:pPr>
       <w:r>
-        <w:t xml:space="preserve">Similarly, while growth was seen in the social sciences this discipline</w:t>
+        <w:t xml:space="preserve">Similarly, while growth was seen in the social sciences, this discipline</w:t>
       </w:r>
       <w:r>
         <w:t xml:space="preserve"> </w:t>
@@ -5547,7 +5588,7 @@
         <w:t xml:space="preserve"> </w:t>
       </w:r>
       <w:r>
-        <w:t xml:space="preserve">dominance, followed by a rise in teams of two and recently teams of</w:t>
+        <w:t xml:space="preserve">dominance, followed by a rise in teams of two and, recently teams of</w:t>
       </w:r>
       <w:r>
         <w:t xml:space="preserve"> </w:t>
@@ -5652,7 +5693,7 @@
         <w:t xml:space="preserve"> </w:t>
       </w:r>
       <w:r>
-        <w:t xml:space="preserve">variation, the broader increase in co-authorship aligns with the</w:t>
+        <w:t xml:space="preserve">variation, the broader increase in co-authorship aligns with the the</w:t>
       </w:r>
       <w:r>
         <w:t xml:space="preserve"> </w:t>
@@ -5819,8 +5860,8 @@
         <w:t xml:space="preserve">fostering impactful collaborations.</w:t>
       </w:r>
     </w:p>
-    <w:bookmarkEnd w:id="72"/>
-    <w:bookmarkStart w:id="76" w:name="Xfbb37cc2c2b497089c86018fedea052ca5879cf"/>
+    <w:bookmarkEnd w:id="74"/>
+    <w:bookmarkStart w:id="78" w:name="Xfbb37cc2c2b497089c86018fedea052ca5879cf"/>
     <w:p>
       <w:pPr>
         <w:pStyle w:val="berschrift2"/>
@@ -5836,7 +5877,7 @@
         <w:t xml:space="preserve">. What characteristics of team composition have the greatest influence on article metrics?</w:t>
       </w:r>
     </w:p>
-    <w:bookmarkStart w:id="73" w:name="gender"/>
+    <w:bookmarkStart w:id="75" w:name="gender"/>
     <w:p>
       <w:pPr>
         <w:pStyle w:val="berschrift3"/>
@@ -5960,7 +6001,7 @@
         <w:t xml:space="preserve"> </w:t>
       </w:r>
       <w:r>
-        <w:t xml:space="preserve">female author in the last place and with male authors in the first spot.</w:t>
+        <w:t xml:space="preserve">female author in the last place and male authors in the first spot.</w:t>
       </w:r>
       <w:r>
         <w:t xml:space="preserve"> </w:t>
@@ -5996,7 +6037,7 @@
         <w:t xml:space="preserve"> </w:t>
       </w:r>
       <w:r>
-        <w:t xml:space="preserve">peer-reviewed contributions, and research that is considered</w:t>
+        <w:t xml:space="preserve">peer-reviewed contributions and research that is considered</w:t>
       </w:r>
       <w:r>
         <w:t xml:space="preserve"> </w:t>
@@ -6061,7 +6102,7 @@
         <w:rPr>
           <w:vertAlign w:val="superscript"/>
         </w:rPr>
-        <w:t xml:space="preserve">31</w:t>
+        <w:t xml:space="preserve">30</w:t>
       </w:r>
       <w:r>
         <w:t xml:space="preserve">. However, systemic</w:t>
@@ -6088,7 +6129,7 @@
         <w:rPr>
           <w:vertAlign w:val="superscript"/>
         </w:rPr>
-        <w:t xml:space="preserve">30</w:t>
+        <w:t xml:space="preserve">32</w:t>
       </w:r>
       <w:r>
         <w:t xml:space="preserve">. Moreover, prior research suggests that gender gaps in</w:t>
@@ -6121,8 +6162,8 @@
         <w:t xml:space="preserve">.</w:t>
       </w:r>
     </w:p>
-    <w:bookmarkEnd w:id="73"/>
-    <w:bookmarkStart w:id="74" w:name="institution-and-country"/>
+    <w:bookmarkEnd w:id="75"/>
+    <w:bookmarkStart w:id="76" w:name="institution-and-country"/>
     <w:p>
       <w:pPr>
         <w:pStyle w:val="berschrift3"/>
@@ -6351,8 +6392,8 @@
         <w:t xml:space="preserve">international partnerships for research advancement.</w:t>
       </w:r>
     </w:p>
-    <w:bookmarkEnd w:id="74"/>
-    <w:bookmarkStart w:id="75" w:name="h-index"/>
+    <w:bookmarkEnd w:id="76"/>
+    <w:bookmarkStart w:id="77" w:name="h-index"/>
     <w:p>
       <w:pPr>
         <w:pStyle w:val="berschrift3"/>
@@ -6500,42 +6541,42 @@
         <w:t xml:space="preserve"> </w:t>
       </w:r>
       <w:r>
-        <w:t xml:space="preserve">norms, early-career researchers, or those publishing in niche areas, may</w:t>
-      </w:r>
-      <w:r>
-        <w:t xml:space="preserve"> </w:t>
-      </w:r>
-      <w:r>
-        <w:t xml:space="preserve">be at a disadvantage. Alternative bibliometric indicators, such as the</w:t>
-      </w:r>
-      <w:r>
-        <w:t xml:space="preserve"> </w:t>
-      </w:r>
-      <w:r>
-        <w:t xml:space="preserve">i10-index or g-index, may provide complementary insights into scholarly</w:t>
-      </w:r>
-      <w:r>
-        <w:t xml:space="preserve"> </w:t>
-      </w:r>
-      <w:r>
-        <w:t xml:space="preserve">impact by addressing some of these limitations. Moreover, as open-access</w:t>
-      </w:r>
-      <w:r>
-        <w:t xml:space="preserve"> </w:t>
-      </w:r>
-      <w:r>
-        <w:t xml:space="preserve">publishing continues to rise, its potential impact on citation</w:t>
-      </w:r>
-      <w:r>
-        <w:t xml:space="preserve"> </w:t>
-      </w:r>
-      <w:r>
-        <w:t xml:space="preserve">disparities linked to h-index should be explored further.</w:t>
+        <w:t xml:space="preserve">norms, early-career researchers, or that those publishing in niche areas</w:t>
+      </w:r>
+      <w:r>
+        <w:t xml:space="preserve"> </w:t>
+      </w:r>
+      <w:r>
+        <w:t xml:space="preserve">may be at a disadvantage. Alternative bibliometric indicators, such as</w:t>
+      </w:r>
+      <w:r>
+        <w:t xml:space="preserve"> </w:t>
+      </w:r>
+      <w:r>
+        <w:t xml:space="preserve">the i10-index or g-index, may provide complementary insights into</w:t>
+      </w:r>
+      <w:r>
+        <w:t xml:space="preserve"> </w:t>
+      </w:r>
+      <w:r>
+        <w:t xml:space="preserve">scholarly impact by addressing some of these limitations. Moreover, as</w:t>
+      </w:r>
+      <w:r>
+        <w:t xml:space="preserve"> </w:t>
+      </w:r>
+      <w:r>
+        <w:t xml:space="preserve">open-access publishing continues to rise, its potential impact on</w:t>
+      </w:r>
+      <w:r>
+        <w:t xml:space="preserve"> </w:t>
+      </w:r>
+      <w:r>
+        <w:t xml:space="preserve">citation disparities linked to h-index should be explored further.</w:t>
       </w:r>
     </w:p>
-    <w:bookmarkEnd w:id="75"/>
-    <w:bookmarkEnd w:id="76"/>
-    <w:bookmarkStart w:id="77" w:name="conclusion-and-future-directions"/>
+    <w:bookmarkEnd w:id="77"/>
+    <w:bookmarkEnd w:id="78"/>
+    <w:bookmarkStart w:id="79" w:name="conclusion-and-future-directions"/>
     <w:p>
       <w:pPr>
         <w:pStyle w:val="berschrift2"/>
@@ -6567,7 +6608,7 @@
         <w:t xml:space="preserve"> </w:t>
       </w:r>
       <w:r>
-        <w:t xml:space="preserve">metrics, gender representation and institutional diversity also play</w:t>
+        <w:t xml:space="preserve">metrics, gender representation, and institutional diversity also play</w:t>
       </w:r>
       <w:r>
         <w:t xml:space="preserve"> </w:t>
@@ -6653,9 +6694,9 @@
         <w:br w:type="page"/>
       </w:r>
     </w:p>
-    <w:bookmarkEnd w:id="77"/>
-    <w:bookmarkEnd w:id="78"/>
-    <w:bookmarkStart w:id="203" w:name="references"/>
+    <w:bookmarkEnd w:id="79"/>
+    <w:bookmarkEnd w:id="80"/>
+    <w:bookmarkStart w:id="205" w:name="references"/>
     <w:p>
       <w:pPr>
         <w:pStyle w:val="berschrift1"/>
@@ -6664,8 +6705,8 @@
         <w:t xml:space="preserve">References</w:t>
       </w:r>
     </w:p>
-    <w:bookmarkStart w:id="202" w:name="refs"/>
-    <w:bookmarkStart w:id="80" w:name="ref-papatheodorou2008"/>
+    <w:bookmarkStart w:id="204" w:name="refs"/>
+    <w:bookmarkStart w:id="82" w:name="ref-papatheodorou2008"/>
     <w:p>
       <w:pPr>
         <w:pStyle w:val="Literaturverzeichnis"/>
@@ -6685,7 +6726,7 @@
       <w:r>
         <w:t xml:space="preserve"> </w:t>
       </w:r>
-      <w:hyperlink r:id="rId79">
+      <w:hyperlink r:id="rId81">
         <w:r>
           <w:rPr>
             <w:rStyle w:val="Hyperlink"/>
@@ -6720,8 +6761,8 @@
         <w:t xml:space="preserve">, 546–551 (2008).</w:t>
       </w:r>
     </w:p>
-    <w:bookmarkEnd w:id="80"/>
-    <w:bookmarkStart w:id="82" w:name="ref-weeks2004"/>
+    <w:bookmarkEnd w:id="82"/>
+    <w:bookmarkStart w:id="84" w:name="ref-weeks2004"/>
     <w:p>
       <w:pPr>
         <w:pStyle w:val="Literaturverzeichnis"/>
@@ -6741,7 +6782,7 @@
       <w:r>
         <w:t xml:space="preserve"> </w:t>
       </w:r>
-      <w:hyperlink r:id="rId81">
+      <w:hyperlink r:id="rId83">
         <w:r>
           <w:rPr>
             <w:rStyle w:val="Hyperlink"/>
@@ -6776,8 +6817,8 @@
         <w:t xml:space="preserve">, 1949–1954 (2004).</w:t>
       </w:r>
     </w:p>
-    <w:bookmarkEnd w:id="82"/>
-    <w:bookmarkStart w:id="84" w:name="ref-zafrunnishan.reddyv.p.2010"/>
+    <w:bookmarkEnd w:id="84"/>
+    <w:bookmarkStart w:id="86" w:name="ref-zafrunnishan.reddyv.p.2010"/>
     <w:p>
       <w:pPr>
         <w:pStyle w:val="Literaturverzeichnis"/>
@@ -6797,7 +6838,7 @@
       <w:r>
         <w:t xml:space="preserve"> </w:t>
       </w:r>
-      <w:hyperlink r:id="rId83">
+      <w:hyperlink r:id="rId85">
         <w:r>
           <w:rPr>
             <w:rStyle w:val="Hyperlink"/>
@@ -6809,8 +6850,8 @@
         <w:t xml:space="preserve">. (2010).</w:t>
       </w:r>
     </w:p>
-    <w:bookmarkEnd w:id="84"/>
-    <w:bookmarkStart w:id="86" w:name="ref-larivière2015"/>
+    <w:bookmarkEnd w:id="86"/>
+    <w:bookmarkStart w:id="88" w:name="ref-larivière2015"/>
     <w:p>
       <w:pPr>
         <w:pStyle w:val="Literaturverzeichnis"/>
@@ -6830,7 +6871,7 @@
       <w:r>
         <w:t xml:space="preserve"> </w:t>
       </w:r>
-      <w:hyperlink r:id="rId85">
+      <w:hyperlink r:id="rId87">
         <w:r>
           <w:rPr>
             <w:rStyle w:val="Hyperlink"/>
@@ -6865,8 +6906,8 @@
         <w:t xml:space="preserve">, 1323–1332 (2015).</w:t>
       </w:r>
     </w:p>
-    <w:bookmarkEnd w:id="86"/>
-    <w:bookmarkStart w:id="88" w:name="ref-wuchty2007"/>
+    <w:bookmarkEnd w:id="88"/>
+    <w:bookmarkStart w:id="90" w:name="ref-wuchty2007"/>
     <w:p>
       <w:pPr>
         <w:pStyle w:val="Literaturverzeichnis"/>
@@ -6886,7 +6927,7 @@
       <w:r>
         <w:t xml:space="preserve"> </w:t>
       </w:r>
-      <w:hyperlink r:id="rId87">
+      <w:hyperlink r:id="rId89">
         <w:r>
           <w:rPr>
             <w:rStyle w:val="Hyperlink"/>
@@ -6921,8 +6962,8 @@
         <w:t xml:space="preserve">, 1036–1039 (2007).</w:t>
       </w:r>
     </w:p>
-    <w:bookmarkEnd w:id="88"/>
-    <w:bookmarkStart w:id="90" w:name="ref-hinnant2012"/>
+    <w:bookmarkEnd w:id="90"/>
+    <w:bookmarkStart w:id="92" w:name="ref-hinnant2012"/>
     <w:p>
       <w:pPr>
         <w:pStyle w:val="Literaturverzeichnis"/>
@@ -6952,7 +6993,7 @@
       <w:r>
         <w:t xml:space="preserve"> </w:t>
       </w:r>
-      <w:hyperlink r:id="rId89">
+      <w:hyperlink r:id="rId91">
         <w:r>
           <w:rPr>
             <w:rStyle w:val="Hyperlink"/>
@@ -6987,8 +7028,8 @@
         <w:t xml:space="preserve">, 249–257 (2012).</w:t>
       </w:r>
     </w:p>
-    <w:bookmarkEnd w:id="90"/>
-    <w:bookmarkStart w:id="92" w:name="ref-freeman2015"/>
+    <w:bookmarkEnd w:id="92"/>
+    <w:bookmarkStart w:id="94" w:name="ref-freeman2015"/>
     <w:p>
       <w:pPr>
         <w:pStyle w:val="Literaturverzeichnis"/>
@@ -7008,7 +7049,7 @@
       <w:r>
         <w:t xml:space="preserve"> </w:t>
       </w:r>
-      <w:hyperlink r:id="rId91">
+      <w:hyperlink r:id="rId93">
         <w:r>
           <w:rPr>
             <w:rStyle w:val="Hyperlink"/>
@@ -7043,8 +7084,8 @@
         <w:t xml:space="preserve">, S289–S318 (2015).</w:t>
       </w:r>
     </w:p>
-    <w:bookmarkEnd w:id="92"/>
-    <w:bookmarkStart w:id="94" w:name="ref-nichols2014"/>
+    <w:bookmarkEnd w:id="94"/>
+    <w:bookmarkStart w:id="96" w:name="ref-nichols2014"/>
     <w:p>
       <w:pPr>
         <w:pStyle w:val="Literaturverzeichnis"/>
@@ -7064,7 +7105,7 @@
       <w:r>
         <w:t xml:space="preserve"> </w:t>
       </w:r>
-      <w:hyperlink r:id="rId93">
+      <w:hyperlink r:id="rId95">
         <w:r>
           <w:rPr>
             <w:rStyle w:val="Hyperlink"/>
@@ -7099,8 +7140,8 @@
         <w:t xml:space="preserve">, 741–754 (2014).</w:t>
       </w:r>
     </w:p>
-    <w:bookmarkEnd w:id="94"/>
-    <w:bookmarkStart w:id="96" w:name="ref-wang2015"/>
+    <w:bookmarkEnd w:id="96"/>
+    <w:bookmarkStart w:id="98" w:name="ref-wang2015"/>
     <w:p>
       <w:pPr>
         <w:pStyle w:val="Literaturverzeichnis"/>
@@ -7120,7 +7161,7 @@
       <w:r>
         <w:t xml:space="preserve"> </w:t>
       </w:r>
-      <w:hyperlink r:id="rId95">
+      <w:hyperlink r:id="rId97">
         <w:r>
           <w:rPr>
             <w:rStyle w:val="Hyperlink"/>
@@ -7155,8 +7196,8 @@
         <w:t xml:space="preserve">, 843–862 (2015).</w:t>
       </w:r>
     </w:p>
-    <w:bookmarkEnd w:id="96"/>
-    <w:bookmarkStart w:id="98" w:name="ref-geraci2015"/>
+    <w:bookmarkEnd w:id="98"/>
+    <w:bookmarkStart w:id="100" w:name="ref-geraci2015"/>
     <w:p>
       <w:pPr>
         <w:pStyle w:val="Literaturverzeichnis"/>
@@ -7176,7 +7217,7 @@
       <w:r>
         <w:t xml:space="preserve"> </w:t>
       </w:r>
-      <w:hyperlink r:id="rId97">
+      <w:hyperlink r:id="rId99">
         <w:r>
           <w:rPr>
             <w:rStyle w:val="Hyperlink"/>
@@ -7211,8 +7252,8 @@
         <w:t xml:space="preserve">, 2023–2034 (2015).</w:t>
       </w:r>
     </w:p>
-    <w:bookmarkEnd w:id="98"/>
-    <w:bookmarkStart w:id="100" w:name="ref-samarasekera2009"/>
+    <w:bookmarkEnd w:id="100"/>
+    <w:bookmarkStart w:id="102" w:name="ref-samarasekera2009"/>
     <w:p>
       <w:pPr>
         <w:pStyle w:val="Literaturverzeichnis"/>
@@ -7232,7 +7273,7 @@
       <w:r>
         <w:t xml:space="preserve"> </w:t>
       </w:r>
-      <w:hyperlink r:id="rId99">
+      <w:hyperlink r:id="rId101">
         <w:r>
           <w:rPr>
             <w:rStyle w:val="Hyperlink"/>
@@ -7267,8 +7308,8 @@
         <w:t xml:space="preserve">, 160–161 (2009).</w:t>
       </w:r>
     </w:p>
-    <w:bookmarkEnd w:id="100"/>
-    <w:bookmarkStart w:id="101" w:name="ref-grossman2002"/>
+    <w:bookmarkEnd w:id="102"/>
+    <w:bookmarkStart w:id="103" w:name="ref-grossman2002"/>
     <w:p>
       <w:pPr>
         <w:pStyle w:val="Literaturverzeichnis"/>
@@ -7309,8 +7350,8 @@
         <w:t xml:space="preserve">, 8–9 (2002).</w:t>
       </w:r>
     </w:p>
-    <w:bookmarkEnd w:id="101"/>
-    <w:bookmarkStart w:id="103" w:name="ref-russell2019"/>
+    <w:bookmarkEnd w:id="103"/>
+    <w:bookmarkStart w:id="105" w:name="ref-russell2019"/>
     <w:p>
       <w:pPr>
         <w:pStyle w:val="Literaturverzeichnis"/>
@@ -7340,7 +7381,7 @@
       <w:r>
         <w:t xml:space="preserve"> </w:t>
       </w:r>
-      <w:hyperlink r:id="rId102">
+      <w:hyperlink r:id="rId104">
         <w:r>
           <w:rPr>
             <w:rStyle w:val="Hyperlink"/>
@@ -7375,8 +7416,8 @@
         <w:t xml:space="preserve">, 239–250 (2019).</w:t>
       </w:r>
     </w:p>
-    <w:bookmarkEnd w:id="103"/>
-    <w:bookmarkStart w:id="105" w:name="ref-nabout2015"/>
+    <w:bookmarkEnd w:id="105"/>
+    <w:bookmarkStart w:id="107" w:name="ref-nabout2015"/>
     <w:p>
       <w:pPr>
         <w:pStyle w:val="Literaturverzeichnis"/>
@@ -7406,7 +7447,7 @@
       <w:r>
         <w:t xml:space="preserve"> </w:t>
       </w:r>
-      <w:hyperlink r:id="rId104">
+      <w:hyperlink r:id="rId106">
         <w:r>
           <w:rPr>
             <w:rStyle w:val="Hyperlink"/>
@@ -7441,8 +7482,8 @@
         <w:t xml:space="preserve">, 357–364 (2015).</w:t>
       </w:r>
     </w:p>
-    <w:bookmarkEnd w:id="105"/>
-    <w:bookmarkStart w:id="107" w:name="ref-hunter2008"/>
+    <w:bookmarkEnd w:id="107"/>
+    <w:bookmarkStart w:id="109" w:name="ref-hunter2008"/>
     <w:p>
       <w:pPr>
         <w:pStyle w:val="Literaturverzeichnis"/>
@@ -7462,7 +7503,7 @@
       <w:r>
         <w:t xml:space="preserve"> </w:t>
       </w:r>
-      <w:hyperlink r:id="rId106">
+      <w:hyperlink r:id="rId108">
         <w:r>
           <w:rPr>
             <w:rStyle w:val="Hyperlink"/>
@@ -7497,8 +7538,8 @@
         <w:t xml:space="preserve">, 290–306 (2008).</w:t>
       </w:r>
     </w:p>
-    <w:bookmarkEnd w:id="107"/>
-    <w:bookmarkStart w:id="109" w:name="ref-kozlowski2017"/>
+    <w:bookmarkEnd w:id="109"/>
+    <w:bookmarkStart w:id="111" w:name="ref-kozlowski2017"/>
     <w:p>
       <w:pPr>
         <w:pStyle w:val="Literaturverzeichnis"/>
@@ -7518,7 +7559,7 @@
       <w:r>
         <w:t xml:space="preserve"> </w:t>
       </w:r>
-      <w:hyperlink r:id="rId108">
+      <w:hyperlink r:id="rId110">
         <w:r>
           <w:rPr>
             <w:rStyle w:val="Hyperlink"/>
@@ -7550,8 +7591,8 @@
         <w:t xml:space="preserve">, 237–253 (2017).</w:t>
       </w:r>
     </w:p>
-    <w:bookmarkEnd w:id="109"/>
-    <w:bookmarkStart w:id="110" w:name="ref-demeuse2014"/>
+    <w:bookmarkEnd w:id="111"/>
+    <w:bookmarkStart w:id="112" w:name="ref-demeuse2014"/>
     <w:p>
       <w:pPr>
         <w:pStyle w:val="Literaturverzeichnis"/>
@@ -7592,8 +7633,8 @@
         <w:t xml:space="preserve">, (2014).</w:t>
       </w:r>
     </w:p>
-    <w:bookmarkEnd w:id="110"/>
-    <w:bookmarkStart w:id="112" w:name="ref-rath2016"/>
+    <w:bookmarkEnd w:id="112"/>
+    <w:bookmarkStart w:id="114" w:name="ref-rath2016"/>
     <w:p>
       <w:pPr>
         <w:pStyle w:val="Literaturverzeichnis"/>
@@ -7613,7 +7654,7 @@
       <w:r>
         <w:t xml:space="preserve"> </w:t>
       </w:r>
-      <w:hyperlink r:id="rId111">
+      <w:hyperlink r:id="rId113">
         <w:r>
           <w:rPr>
             <w:rStyle w:val="Hyperlink"/>
@@ -7648,8 +7689,8 @@
         <w:t xml:space="preserve">, 897–902 (2016).</w:t>
       </w:r>
     </w:p>
-    <w:bookmarkEnd w:id="112"/>
-    <w:bookmarkStart w:id="114" w:name="ref-gaunt2014"/>
+    <w:bookmarkEnd w:id="114"/>
+    <w:bookmarkStart w:id="116" w:name="ref-gaunt2014"/>
     <w:p>
       <w:pPr>
         <w:pStyle w:val="Literaturverzeichnis"/>
@@ -7669,7 +7710,7 @@
       <w:r>
         <w:t xml:space="preserve"> </w:t>
       </w:r>
-      <w:hyperlink r:id="rId113">
+      <w:hyperlink r:id="rId115">
         <w:r>
           <w:rPr>
             <w:rStyle w:val="Hyperlink"/>
@@ -7718,8 +7759,8 @@
         <w:t xml:space="preserve">, 441–465 (2014).</w:t>
       </w:r>
     </w:p>
-    <w:bookmarkEnd w:id="114"/>
-    <w:bookmarkStart w:id="116" w:name="ref-thijs2015"/>
+    <w:bookmarkEnd w:id="116"/>
+    <w:bookmarkStart w:id="118" w:name="ref-thijs2015"/>
     <w:p>
       <w:pPr>
         <w:pStyle w:val="Literaturverzeichnis"/>
@@ -7736,7 +7777,7 @@
       <w:r>
         <w:t xml:space="preserve">Thijs, B., Costas, R. &amp; Glänzel, W. Multi-authorship and citation advantage, a mythical relationship. (2015) doi:</w:t>
       </w:r>
-      <w:hyperlink r:id="rId115">
+      <w:hyperlink r:id="rId117">
         <w:r>
           <w:rPr>
             <w:rStyle w:val="Hyperlink"/>
@@ -7748,8 +7789,8 @@
         <w:t xml:space="preserve">.</w:t>
       </w:r>
     </w:p>
-    <w:bookmarkEnd w:id="116"/>
-    <w:bookmarkStart w:id="118" w:name="ref-abu2019"/>
+    <w:bookmarkEnd w:id="118"/>
+    <w:bookmarkStart w:id="120" w:name="ref-abu2019"/>
     <w:p>
       <w:pPr>
         <w:pStyle w:val="Literaturverzeichnis"/>
@@ -7769,7 +7810,7 @@
       <w:r>
         <w:t xml:space="preserve"> </w:t>
       </w:r>
-      <w:hyperlink r:id="rId117">
+      <w:hyperlink r:id="rId119">
         <w:r>
           <w:rPr>
             <w:rStyle w:val="Hyperlink"/>
@@ -7797,8 +7838,8 @@
         <w:t xml:space="preserve">1–11 (2019).</w:t>
       </w:r>
     </w:p>
-    <w:bookmarkEnd w:id="118"/>
-    <w:bookmarkStart w:id="120" w:name="ref-leifeld2017"/>
+    <w:bookmarkEnd w:id="120"/>
+    <w:bookmarkStart w:id="122" w:name="ref-leifeld2017"/>
     <w:p>
       <w:pPr>
         <w:pStyle w:val="Literaturverzeichnis"/>
@@ -7818,7 +7859,7 @@
       <w:r>
         <w:t xml:space="preserve"> </w:t>
       </w:r>
-      <w:hyperlink r:id="rId119">
+      <w:hyperlink r:id="rId121">
         <w:r>
           <w:rPr>
             <w:rStyle w:val="Hyperlink"/>
@@ -7853,8 +7894,8 @@
         <w:t xml:space="preserve">, e0174671 (2017).</w:t>
       </w:r>
     </w:p>
-    <w:bookmarkEnd w:id="120"/>
-    <w:bookmarkStart w:id="122" w:name="ref-jagsi2006"/>
+    <w:bookmarkEnd w:id="122"/>
+    <w:bookmarkStart w:id="124" w:name="ref-jagsi2006"/>
     <w:p>
       <w:pPr>
         <w:pStyle w:val="Literaturverzeichnis"/>
@@ -7884,7 +7925,7 @@
       <w:r>
         <w:t xml:space="preserve"> </w:t>
       </w:r>
-      <w:hyperlink r:id="rId121">
+      <w:hyperlink r:id="rId123">
         <w:r>
           <w:rPr>
             <w:rStyle w:val="Hyperlink"/>
@@ -7973,8 +8014,8 @@
         <w:t xml:space="preserve">, 281–287 (2006).</w:t>
       </w:r>
     </w:p>
-    <w:bookmarkEnd w:id="122"/>
-    <w:bookmarkStart w:id="124" w:name="ref-west2013"/>
+    <w:bookmarkEnd w:id="124"/>
+    <w:bookmarkStart w:id="126" w:name="ref-west2013"/>
     <w:p>
       <w:pPr>
         <w:pStyle w:val="Literaturverzeichnis"/>
@@ -7994,7 +8035,7 @@
       <w:r>
         <w:t xml:space="preserve"> </w:t>
       </w:r>
-      <w:hyperlink r:id="rId123">
+      <w:hyperlink r:id="rId125">
         <w:r>
           <w:rPr>
             <w:rStyle w:val="Hyperlink"/>
@@ -8029,8 +8070,8 @@
         <w:t xml:space="preserve">, e66212 (2013).</w:t>
       </w:r>
     </w:p>
-    <w:bookmarkEnd w:id="124"/>
-    <w:bookmarkStart w:id="126" w:name="ref-rigg2012"/>
+    <w:bookmarkEnd w:id="126"/>
+    <w:bookmarkStart w:id="128" w:name="ref-rigg2012"/>
     <w:p>
       <w:pPr>
         <w:pStyle w:val="Literaturverzeichnis"/>
@@ -8050,7 +8091,7 @@
       <w:r>
         <w:t xml:space="preserve"> </w:t>
       </w:r>
-      <w:hyperlink r:id="rId125">
+      <w:hyperlink r:id="rId127">
         <w:r>
           <w:rPr>
             <w:rStyle w:val="Hyperlink"/>
@@ -8085,8 +8126,8 @@
         <w:t xml:space="preserve">, 491–502 (2012).</w:t>
       </w:r>
     </w:p>
-    <w:bookmarkEnd w:id="126"/>
-    <w:bookmarkStart w:id="128" w:name="ref-süßenbacher2017"/>
+    <w:bookmarkEnd w:id="128"/>
+    <w:bookmarkStart w:id="130" w:name="ref-süßenbacher2017"/>
     <w:p>
       <w:pPr>
         <w:pStyle w:val="Literaturverzeichnis"/>
@@ -8106,7 +8147,7 @@
       <w:r>
         <w:t xml:space="preserve"> </w:t>
       </w:r>
-      <w:hyperlink r:id="rId127">
+      <w:hyperlink r:id="rId129">
         <w:r>
           <w:rPr>
             <w:rStyle w:val="Hyperlink"/>
@@ -8141,8 +8182,8 @@
         <w:t xml:space="preserve">, 90–95 (2017).</w:t>
       </w:r>
     </w:p>
-    <w:bookmarkEnd w:id="128"/>
-    <w:bookmarkStart w:id="130" w:name="ref-cushman2022"/>
+    <w:bookmarkEnd w:id="130"/>
+    <w:bookmarkStart w:id="132" w:name="ref-cushman2022"/>
     <w:p>
       <w:pPr>
         <w:pStyle w:val="Literaturverzeichnis"/>
@@ -8162,7 +8203,7 @@
       <w:r>
         <w:t xml:space="preserve"> </w:t>
       </w:r>
-      <w:hyperlink r:id="rId129">
+      <w:hyperlink r:id="rId131">
         <w:r>
           <w:rPr>
             <w:rStyle w:val="Hyperlink"/>
@@ -8197,8 +8238,8 @@
         <w:t xml:space="preserve">, e025456 (2022).</w:t>
       </w:r>
     </w:p>
-    <w:bookmarkEnd w:id="130"/>
-    <w:bookmarkStart w:id="132" w:name="ref-mihaljevic-brandt2016"/>
+    <w:bookmarkEnd w:id="132"/>
+    <w:bookmarkStart w:id="134" w:name="ref-mihaljevic-brandt2016"/>
     <w:p>
       <w:pPr>
         <w:pStyle w:val="Literaturverzeichnis"/>
@@ -8218,7 +8259,7 @@
       <w:r>
         <w:t xml:space="preserve"> </w:t>
       </w:r>
-      <w:hyperlink r:id="rId131">
+      <w:hyperlink r:id="rId133">
         <w:r>
           <w:rPr>
             <w:rStyle w:val="Hyperlink"/>
@@ -8253,8 +8294,8 @@
         <w:t xml:space="preserve">, e0165367 (2016).</w:t>
       </w:r>
     </w:p>
-    <w:bookmarkEnd w:id="132"/>
-    <w:bookmarkStart w:id="134" w:name="ref-bonham2017"/>
+    <w:bookmarkEnd w:id="134"/>
+    <w:bookmarkStart w:id="136" w:name="ref-bonham2017"/>
     <w:p>
       <w:pPr>
         <w:pStyle w:val="Literaturverzeichnis"/>
@@ -8274,7 +8315,7 @@
       <w:r>
         <w:t xml:space="preserve"> </w:t>
       </w:r>
-      <w:hyperlink r:id="rId133">
+      <w:hyperlink r:id="rId135">
         <w:r>
           <w:rPr>
             <w:rStyle w:val="Hyperlink"/>
@@ -8309,65 +8350,6 @@
         <w:t xml:space="preserve">, e1005134 (2017).</w:t>
       </w:r>
     </w:p>
-    <w:bookmarkEnd w:id="134"/>
-    <w:bookmarkStart w:id="136" w:name="ref-ross2022"/>
-    <w:p>
-      <w:pPr>
-        <w:pStyle w:val="Literaturverzeichnis"/>
-      </w:pPr>
-      <w:r>
-        <w:t xml:space="preserve">30.</w:t>
-      </w:r>
-      <w:r>
-        <w:t xml:space="preserve"> </w:t>
-      </w:r>
-      <w:r>
-        <w:t xml:space="preserve">	</w:t>
-      </w:r>
-      <w:r>
-        <w:t xml:space="preserve">Ross, M. B.</w:t>
-      </w:r>
-      <w:r>
-        <w:t xml:space="preserve"> </w:t>
-      </w:r>
-      <w:r>
-        <w:rPr>
-          <w:i/>
-          <w:iCs/>
-        </w:rPr>
-        <w:t xml:space="preserve">et al.</w:t>
-      </w:r>
-      <w:r>
-        <w:t xml:space="preserve"> Women are Credited Less in Science than are Men.</w:t>
-      </w:r>
-      <w:r>
-        <w:t xml:space="preserve"> </w:t>
-      </w:r>
-      <w:r>
-        <w:rPr>
-          <w:i/>
-          <w:iCs/>
-        </w:rPr>
-        <w:t xml:space="preserve">Nature</w:t>
-      </w:r>
-      <w:r>
-        <w:t xml:space="preserve"> </w:t>
-      </w:r>
-      <w:r>
-        <w:t xml:space="preserve">(2022) doi:</w:t>
-      </w:r>
-      <w:hyperlink r:id="rId135">
-        <w:r>
-          <w:rPr>
-            <w:rStyle w:val="Hyperlink"/>
-          </w:rPr>
-          <w:t xml:space="preserve">10.1038/s41586-022-04966-w</w:t>
-        </w:r>
-      </w:hyperlink>
-      <w:r>
-        <w:t xml:space="preserve">.</w:t>
-      </w:r>
-    </w:p>
     <w:bookmarkEnd w:id="136"/>
     <w:bookmarkStart w:id="138" w:name="ref-zeng2016"/>
     <w:p>
@@ -8375,7 +8357,7 @@
         <w:pStyle w:val="Literaturverzeichnis"/>
       </w:pPr>
       <w:r>
-        <w:t xml:space="preserve">31.</w:t>
+        <w:t xml:space="preserve">30.</w:t>
       </w:r>
       <w:r>
         <w:t xml:space="preserve"> </w:t>
@@ -8441,7 +8423,7 @@
         <w:pStyle w:val="Literaturverzeichnis"/>
       </w:pPr>
       <w:r>
-        <w:t xml:space="preserve">32.</w:t>
+        <w:t xml:space="preserve">31.</w:t>
       </w:r>
       <w:r>
         <w:t xml:space="preserve"> </w:t>
@@ -8467,12 +8449,71 @@
       </w:r>
     </w:p>
     <w:bookmarkEnd w:id="139"/>
-    <w:bookmarkStart w:id="141" w:name="ref-maliniak2013"/>
+    <w:bookmarkStart w:id="141" w:name="ref-ross2022"/>
     <w:p>
       <w:pPr>
         <w:pStyle w:val="Literaturverzeichnis"/>
       </w:pPr>
       <w:r>
+        <w:t xml:space="preserve">32.</w:t>
+      </w:r>
+      <w:r>
+        <w:t xml:space="preserve"> </w:t>
+      </w:r>
+      <w:r>
+        <w:t xml:space="preserve">	</w:t>
+      </w:r>
+      <w:r>
+        <w:t xml:space="preserve">Ross, M. B.</w:t>
+      </w:r>
+      <w:r>
+        <w:t xml:space="preserve"> </w:t>
+      </w:r>
+      <w:r>
+        <w:rPr>
+          <w:i/>
+          <w:iCs/>
+        </w:rPr>
+        <w:t xml:space="preserve">et al.</w:t>
+      </w:r>
+      <w:r>
+        <w:t xml:space="preserve"> Women are Credited Less in Science than are Men.</w:t>
+      </w:r>
+      <w:r>
+        <w:t xml:space="preserve"> </w:t>
+      </w:r>
+      <w:r>
+        <w:rPr>
+          <w:i/>
+          <w:iCs/>
+        </w:rPr>
+        <w:t xml:space="preserve">Nature</w:t>
+      </w:r>
+      <w:r>
+        <w:t xml:space="preserve"> </w:t>
+      </w:r>
+      <w:r>
+        <w:t xml:space="preserve">(2022) doi:</w:t>
+      </w:r>
+      <w:hyperlink r:id="rId140">
+        <w:r>
+          <w:rPr>
+            <w:rStyle w:val="Hyperlink"/>
+          </w:rPr>
+          <w:t xml:space="preserve">10.1038/s41586-022-04966-w</w:t>
+        </w:r>
+      </w:hyperlink>
+      <w:r>
+        <w:t xml:space="preserve">.</w:t>
+      </w:r>
+    </w:p>
+    <w:bookmarkEnd w:id="141"/>
+    <w:bookmarkStart w:id="143" w:name="ref-maliniak2013"/>
+    <w:p>
+      <w:pPr>
+        <w:pStyle w:val="Literaturverzeichnis"/>
+      </w:pPr>
+      <w:r>
         <w:t xml:space="preserve">33.</w:t>
       </w:r>
       <w:r>
@@ -8487,7 +8528,7 @@
       <w:r>
         <w:t xml:space="preserve"> </w:t>
       </w:r>
-      <w:hyperlink r:id="rId140">
+      <w:hyperlink r:id="rId142">
         <w:r>
           <w:rPr>
             <w:rStyle w:val="Hyperlink"/>
@@ -8522,8 +8563,8 @@
         <w:t xml:space="preserve">, 889–922 (2013).</w:t>
       </w:r>
     </w:p>
-    <w:bookmarkEnd w:id="141"/>
-    <w:bookmarkStart w:id="143" w:name="ref-cameron2016"/>
+    <w:bookmarkEnd w:id="143"/>
+    <w:bookmarkStart w:id="145" w:name="ref-cameron2016"/>
     <w:p>
       <w:pPr>
         <w:pStyle w:val="Literaturverzeichnis"/>
@@ -8543,7 +8584,7 @@
       <w:r>
         <w:t xml:space="preserve"> </w:t>
       </w:r>
-      <w:hyperlink r:id="rId142">
+      <w:hyperlink r:id="rId144">
         <w:r>
           <w:rPr>
             <w:rStyle w:val="Hyperlink"/>
@@ -8575,8 +8616,8 @@
         <w:t xml:space="preserve">, 245–252 (2016).</w:t>
       </w:r>
     </w:p>
-    <w:bookmarkEnd w:id="143"/>
-    <w:bookmarkStart w:id="145" w:name="ref-hutson2002"/>
+    <w:bookmarkEnd w:id="145"/>
+    <w:bookmarkStart w:id="147" w:name="ref-hutson2002"/>
     <w:p>
       <w:pPr>
         <w:pStyle w:val="Literaturverzeichnis"/>
@@ -8596,7 +8637,7 @@
       <w:r>
         <w:t xml:space="preserve"> </w:t>
       </w:r>
-      <w:hyperlink r:id="rId144">
+      <w:hyperlink r:id="rId146">
         <w:r>
           <w:rPr>
             <w:rStyle w:val="Hyperlink"/>
@@ -8657,8 +8698,8 @@
         <w:t xml:space="preserve">, 331–342 (2002).</w:t>
       </w:r>
     </w:p>
-    <w:bookmarkEnd w:id="145"/>
-    <w:bookmarkStart w:id="147" w:name="ref-rezek2011"/>
+    <w:bookmarkEnd w:id="147"/>
+    <w:bookmarkStart w:id="149" w:name="ref-rezek2011"/>
     <w:p>
       <w:pPr>
         <w:pStyle w:val="Literaturverzeichnis"/>
@@ -8678,7 +8719,7 @@
       <w:r>
         <w:t xml:space="preserve"> </w:t>
       </w:r>
-      <w:hyperlink r:id="rId146">
+      <w:hyperlink r:id="rId148">
         <w:r>
           <w:rPr>
             <w:rStyle w:val="Hyperlink"/>
@@ -8710,8 +8751,8 @@
         <w:t xml:space="preserve">, 1337–1340 (2011).</w:t>
       </w:r>
     </w:p>
-    <w:bookmarkEnd w:id="147"/>
-    <w:bookmarkStart w:id="149" w:name="ref-hirsch2005"/>
+    <w:bookmarkEnd w:id="149"/>
+    <w:bookmarkStart w:id="151" w:name="ref-hirsch2005"/>
     <w:p>
       <w:pPr>
         <w:pStyle w:val="Literaturverzeichnis"/>
@@ -8731,7 +8772,7 @@
       <w:r>
         <w:t xml:space="preserve"> </w:t>
       </w:r>
-      <w:hyperlink r:id="rId148">
+      <w:hyperlink r:id="rId150">
         <w:r>
           <w:rPr>
             <w:rStyle w:val="Hyperlink"/>
@@ -8766,8 +8807,8 @@
         <w:t xml:space="preserve">, 16569–16572 (2005).</w:t>
       </w:r>
     </w:p>
-    <w:bookmarkEnd w:id="149"/>
-    <w:bookmarkStart w:id="151" w:name="ref-crespo2019"/>
+    <w:bookmarkEnd w:id="151"/>
+    <w:bookmarkStart w:id="153" w:name="ref-crespo2019"/>
     <w:p>
       <w:pPr>
         <w:pStyle w:val="Literaturverzeichnis"/>
@@ -8787,7 +8828,7 @@
       <w:r>
         <w:t xml:space="preserve"> </w:t>
       </w:r>
-      <w:hyperlink r:id="rId150">
+      <w:hyperlink r:id="rId152">
         <w:r>
           <w:rPr>
             <w:rStyle w:val="Hyperlink"/>
@@ -8831,8 +8872,8 @@
         <w:t xml:space="preserve">, 2495–2506 (2019).</w:t>
       </w:r>
     </w:p>
-    <w:bookmarkEnd w:id="151"/>
-    <w:bookmarkStart w:id="153" w:name="ref-østby2013"/>
+    <w:bookmarkEnd w:id="153"/>
+    <w:bookmarkStart w:id="155" w:name="ref-østby2013"/>
     <w:p>
       <w:pPr>
         <w:pStyle w:val="Literaturverzeichnis"/>
@@ -8852,7 +8893,7 @@
       <w:r>
         <w:t xml:space="preserve"> </w:t>
       </w:r>
-      <w:hyperlink r:id="rId152">
+      <w:hyperlink r:id="rId154">
         <w:r>
           <w:rPr>
             <w:rStyle w:val="Hyperlink"/>
@@ -8913,8 +8954,8 @@
         <w:t xml:space="preserve">, 493–506 (2013).</w:t>
       </w:r>
     </w:p>
-    <w:bookmarkEnd w:id="153"/>
-    <w:bookmarkStart w:id="155" w:name="ref-brown2009"/>
+    <w:bookmarkEnd w:id="155"/>
+    <w:bookmarkStart w:id="157" w:name="ref-brown2009"/>
     <w:p>
       <w:pPr>
         <w:pStyle w:val="Literaturverzeichnis"/>
@@ -8934,7 +8975,7 @@
       <w:r>
         <w:t xml:space="preserve"> </w:t>
       </w:r>
-      <w:hyperlink r:id="rId154">
+      <w:hyperlink r:id="rId156">
         <w:r>
           <w:rPr>
             <w:rStyle w:val="Hyperlink"/>
@@ -9045,8 +9086,8 @@
         <w:t xml:space="preserve">, 1129–1136 (2009).</w:t>
       </w:r>
     </w:p>
-    <w:bookmarkEnd w:id="155"/>
-    <w:bookmarkStart w:id="157" w:name="ref-kliegl2011"/>
+    <w:bookmarkEnd w:id="157"/>
+    <w:bookmarkStart w:id="159" w:name="ref-kliegl2011"/>
     <w:p>
       <w:pPr>
         <w:pStyle w:val="Literaturverzeichnis"/>
@@ -9066,7 +9107,7 @@
       <w:r>
         <w:t xml:space="preserve"> </w:t>
       </w:r>
-      <w:hyperlink r:id="rId156">
+      <w:hyperlink r:id="rId158">
         <w:r>
           <w:rPr>
             <w:rStyle w:val="Hyperlink"/>
@@ -9101,8 +9142,8 @@
         <w:t xml:space="preserve">, 149–158 (2011).</w:t>
       </w:r>
     </w:p>
-    <w:bookmarkEnd w:id="157"/>
-    <w:bookmarkStart w:id="159" w:name="ref-coccia2016"/>
+    <w:bookmarkEnd w:id="159"/>
+    <w:bookmarkStart w:id="161" w:name="ref-coccia2016"/>
     <w:p>
       <w:pPr>
         <w:pStyle w:val="Literaturverzeichnis"/>
@@ -9122,7 +9163,7 @@
       <w:r>
         <w:t xml:space="preserve"> </w:t>
       </w:r>
-      <w:hyperlink r:id="rId158">
+      <w:hyperlink r:id="rId160">
         <w:r>
           <w:rPr>
             <w:rStyle w:val="Hyperlink"/>
@@ -9157,8 +9198,8 @@
         <w:t xml:space="preserve">, 2057–2061 (2016).</w:t>
       </w:r>
     </w:p>
-    <w:bookmarkEnd w:id="159"/>
-    <w:bookmarkStart w:id="161" w:name="ref-coccia2016a"/>
+    <w:bookmarkEnd w:id="161"/>
+    <w:bookmarkStart w:id="163" w:name="ref-coccia2016a"/>
     <w:p>
       <w:pPr>
         <w:pStyle w:val="Literaturverzeichnis"/>
@@ -9178,7 +9219,7 @@
       <w:r>
         <w:t xml:space="preserve"> </w:t>
       </w:r>
-      <w:hyperlink r:id="rId160">
+      <w:hyperlink r:id="rId162">
         <w:r>
           <w:rPr>
             <w:rStyle w:val="Hyperlink"/>
@@ -9213,8 +9254,8 @@
         <w:t xml:space="preserve">, 1065–1084 (2016).</w:t>
       </w:r>
     </w:p>
-    <w:bookmarkEnd w:id="161"/>
-    <w:bookmarkStart w:id="163" w:name="ref-katz1997"/>
+    <w:bookmarkEnd w:id="163"/>
+    <w:bookmarkStart w:id="165" w:name="ref-katz1997"/>
     <w:p>
       <w:pPr>
         <w:pStyle w:val="Literaturverzeichnis"/>
@@ -9234,7 +9275,7 @@
       <w:r>
         <w:t xml:space="preserve"> </w:t>
       </w:r>
-      <w:hyperlink r:id="rId162">
+      <w:hyperlink r:id="rId164">
         <w:r>
           <w:rPr>
             <w:rStyle w:val="Hyperlink"/>
@@ -9269,8 +9310,8 @@
         <w:t xml:space="preserve">, 541–554 (1997).</w:t>
       </w:r>
     </w:p>
-    <w:bookmarkEnd w:id="163"/>
-    <w:bookmarkStart w:id="165" w:name="ref-khor2016"/>
+    <w:bookmarkEnd w:id="165"/>
+    <w:bookmarkStart w:id="167" w:name="ref-khor2016"/>
     <w:p>
       <w:pPr>
         <w:pStyle w:val="Literaturverzeichnis"/>
@@ -9290,7 +9331,7 @@
       <w:r>
         <w:t xml:space="preserve"> </w:t>
       </w:r>
-      <w:hyperlink r:id="rId164">
+      <w:hyperlink r:id="rId166">
         <w:r>
           <w:rPr>
             <w:rStyle w:val="Hyperlink"/>
@@ -9325,8 +9366,8 @@
         <w:t xml:space="preserve">, 1095–1110 (2016).</w:t>
       </w:r>
     </w:p>
-    <w:bookmarkEnd w:id="165"/>
-    <w:bookmarkStart w:id="167" w:name="ref-rousseau2016"/>
+    <w:bookmarkEnd w:id="167"/>
+    <w:bookmarkStart w:id="169" w:name="ref-rousseau2016"/>
     <w:p>
       <w:pPr>
         <w:pStyle w:val="Literaturverzeichnis"/>
@@ -9346,7 +9387,7 @@
       <w:r>
         <w:t xml:space="preserve"> </w:t>
       </w:r>
-      <w:hyperlink r:id="rId166">
+      <w:hyperlink r:id="rId168">
         <w:r>
           <w:rPr>
             <w:rStyle w:val="Hyperlink"/>
@@ -9378,8 +9419,8 @@
         <w:t xml:space="preserve">, 1009–1013 (2016).</w:t>
       </w:r>
     </w:p>
-    <w:bookmarkEnd w:id="167"/>
-    <w:bookmarkStart w:id="169" w:name="ref-walsh2007"/>
+    <w:bookmarkEnd w:id="169"/>
+    <w:bookmarkStart w:id="171" w:name="ref-walsh2007"/>
     <w:p>
       <w:pPr>
         <w:pStyle w:val="Literaturverzeichnis"/>
@@ -9399,7 +9440,7 @@
       <w:r>
         <w:t xml:space="preserve"> </w:t>
       </w:r>
-      <w:hyperlink r:id="rId168">
+      <w:hyperlink r:id="rId170">
         <w:r>
           <w:rPr>
             <w:rStyle w:val="Hyperlink"/>
@@ -9434,8 +9475,8 @@
         <w:t xml:space="preserve">, 712–732 (2007).</w:t>
       </w:r>
     </w:p>
-    <w:bookmarkEnd w:id="169"/>
-    <w:bookmarkStart w:id="170" w:name="ref-boyle2006"/>
+    <w:bookmarkEnd w:id="171"/>
+    <w:bookmarkStart w:id="172" w:name="ref-boyle2006"/>
     <w:p>
       <w:pPr>
         <w:pStyle w:val="Literaturverzeichnis"/>
@@ -9479,8 +9520,8 @@
         <w:t xml:space="preserve">, 147–153 (2006).</w:t>
       </w:r>
     </w:p>
-    <w:bookmarkEnd w:id="170"/>
-    <w:bookmarkStart w:id="171" w:name="ref-champely2017"/>
+    <w:bookmarkEnd w:id="172"/>
+    <w:bookmarkStart w:id="173" w:name="ref-champely2017"/>
     <w:p>
       <w:pPr>
         <w:pStyle w:val="Literaturverzeichnis"/>
@@ -9511,8 +9552,8 @@
         <w:t xml:space="preserve"> Pwr: Basic functions for power analysis. (2017).</w:t>
       </w:r>
     </w:p>
-    <w:bookmarkEnd w:id="171"/>
-    <w:bookmarkStart w:id="173" w:name="ref-aust2022"/>
+    <w:bookmarkEnd w:id="173"/>
+    <w:bookmarkStart w:id="175" w:name="ref-aust2022"/>
     <w:p>
       <w:pPr>
         <w:pStyle w:val="Literaturverzeichnis"/>
@@ -9542,7 +9583,7 @@
       <w:r>
         <w:t xml:space="preserve"> </w:t>
       </w:r>
-      <w:hyperlink r:id="rId172">
+      <w:hyperlink r:id="rId174">
         <w:r>
           <w:rPr>
             <w:rStyle w:val="Hyperlink"/>
@@ -9556,8 +9597,8 @@
         <w:t xml:space="preserve">. (2022).</w:t>
       </w:r>
     </w:p>
-    <w:bookmarkEnd w:id="173"/>
-    <w:bookmarkStart w:id="175" w:name="ref-kelley2022"/>
+    <w:bookmarkEnd w:id="175"/>
+    <w:bookmarkStart w:id="177" w:name="ref-kelley2022"/>
     <w:p>
       <w:pPr>
         <w:pStyle w:val="Literaturverzeichnis"/>
@@ -9577,7 +9618,7 @@
       <w:r>
         <w:t xml:space="preserve"> </w:t>
       </w:r>
-      <w:hyperlink r:id="rId174">
+      <w:hyperlink r:id="rId176">
         <w:r>
           <w:rPr>
             <w:rStyle w:val="Hyperlink"/>
@@ -9591,8 +9632,8 @@
         <w:t xml:space="preserve">. (2022).</w:t>
       </w:r>
     </w:p>
-    <w:bookmarkEnd w:id="175"/>
-    <w:bookmarkStart w:id="177" w:name="ref-pyspark"/>
+    <w:bookmarkEnd w:id="177"/>
+    <w:bookmarkStart w:id="179" w:name="ref-pyspark"/>
     <w:p>
       <w:pPr>
         <w:pStyle w:val="Literaturverzeichnis"/>
@@ -9606,7 +9647,7 @@
       <w:r>
         <w:t xml:space="preserve">	</w:t>
       </w:r>
-      <w:hyperlink r:id="rId176">
+      <w:hyperlink r:id="rId178">
         <w:r>
           <w:rPr>
             <w:rStyle w:val="Hyperlink"/>
@@ -9636,8 +9677,8 @@
         <w:t xml:space="preserve">.</w:t>
       </w:r>
     </w:p>
-    <w:bookmarkEnd w:id="177"/>
-    <w:bookmarkStart w:id="179" w:name="ref-R-base"/>
+    <w:bookmarkEnd w:id="179"/>
+    <w:bookmarkStart w:id="181" w:name="ref-R-base"/>
     <w:p>
       <w:pPr>
         <w:pStyle w:val="Literaturverzeichnis"/>
@@ -9670,7 +9711,7 @@
       <w:r>
         <w:t xml:space="preserve"> </w:t>
       </w:r>
-      <w:hyperlink r:id="rId178">
+      <w:hyperlink r:id="rId180">
         <w:r>
           <w:rPr>
             <w:rStyle w:val="Hyperlink"/>
@@ -9685,8 +9726,8 @@
         <w:t xml:space="preserve">(2022).</w:t>
       </w:r>
     </w:p>
-    <w:bookmarkEnd w:id="179"/>
-    <w:bookmarkStart w:id="181" w:name="ref-R-dplyr"/>
+    <w:bookmarkEnd w:id="181"/>
+    <w:bookmarkStart w:id="183" w:name="ref-R-dplyr"/>
     <w:p>
       <w:pPr>
         <w:pStyle w:val="Literaturverzeichnis"/>
@@ -9719,7 +9760,7 @@
       <w:r>
         <w:t xml:space="preserve"> </w:t>
       </w:r>
-      <w:hyperlink r:id="rId180">
+      <w:hyperlink r:id="rId182">
         <w:r>
           <w:rPr>
             <w:rStyle w:val="Hyperlink"/>
@@ -9734,8 +9775,8 @@
         <w:t xml:space="preserve">(2020).</w:t>
       </w:r>
     </w:p>
-    <w:bookmarkEnd w:id="181"/>
-    <w:bookmarkStart w:id="183" w:name="ref-becker2021"/>
+    <w:bookmarkEnd w:id="183"/>
+    <w:bookmarkStart w:id="185" w:name="ref-becker2021"/>
     <w:p>
       <w:pPr>
         <w:pStyle w:val="Literaturverzeichnis"/>
@@ -9765,7 +9806,7 @@
       <w:r>
         <w:t xml:space="preserve"> </w:t>
       </w:r>
-      <w:hyperlink r:id="rId182">
+      <w:hyperlink r:id="rId184">
         <w:r>
           <w:rPr>
             <w:rStyle w:val="Hyperlink"/>
@@ -9779,8 +9820,8 @@
         <w:t xml:space="preserve">. (2021).</w:t>
       </w:r>
     </w:p>
-    <w:bookmarkEnd w:id="183"/>
-    <w:bookmarkStart w:id="185" w:name="ref-R-tidyr"/>
+    <w:bookmarkEnd w:id="185"/>
+    <w:bookmarkStart w:id="187" w:name="ref-R-tidyr"/>
     <w:p>
       <w:pPr>
         <w:pStyle w:val="Literaturverzeichnis"/>
@@ -9813,7 +9854,7 @@
       <w:r>
         <w:t xml:space="preserve"> </w:t>
       </w:r>
-      <w:hyperlink r:id="rId184">
+      <w:hyperlink r:id="rId186">
         <w:r>
           <w:rPr>
             <w:rStyle w:val="Hyperlink"/>
@@ -9828,8 +9869,8 @@
         <w:t xml:space="preserve">(2020).</w:t>
       </w:r>
     </w:p>
-    <w:bookmarkEnd w:id="185"/>
-    <w:bookmarkStart w:id="187" w:name="ref-R-patchwork"/>
+    <w:bookmarkEnd w:id="187"/>
+    <w:bookmarkStart w:id="189" w:name="ref-R-patchwork"/>
     <w:p>
       <w:pPr>
         <w:pStyle w:val="Literaturverzeichnis"/>
@@ -9862,7 +9903,7 @@
       <w:r>
         <w:t xml:space="preserve"> </w:t>
       </w:r>
-      <w:hyperlink r:id="rId186">
+      <w:hyperlink r:id="rId188">
         <w:r>
           <w:rPr>
             <w:rStyle w:val="Hyperlink"/>
@@ -9877,8 +9918,8 @@
         <w:t xml:space="preserve">(2020).</w:t>
       </w:r>
     </w:p>
-    <w:bookmarkEnd w:id="187"/>
-    <w:bookmarkStart w:id="189" w:name="ref-R-ggplot2"/>
+    <w:bookmarkEnd w:id="189"/>
+    <w:bookmarkStart w:id="191" w:name="ref-R-ggplot2"/>
     <w:p>
       <w:pPr>
         <w:pStyle w:val="Literaturverzeichnis"/>
@@ -9898,7 +9939,7 @@
       <w:r>
         <w:t xml:space="preserve"> </w:t>
       </w:r>
-      <w:hyperlink r:id="rId188">
+      <w:hyperlink r:id="rId190">
         <w:r>
           <w:rPr>
             <w:rStyle w:val="Hyperlink"/>
@@ -9912,8 +9953,8 @@
         <w:t xml:space="preserve">. (Springer-Verlag New York, 2016).</w:t>
       </w:r>
     </w:p>
-    <w:bookmarkEnd w:id="189"/>
-    <w:bookmarkStart w:id="191" w:name="ref-henriksen2016"/>
+    <w:bookmarkEnd w:id="191"/>
+    <w:bookmarkStart w:id="193" w:name="ref-henriksen2016"/>
     <w:p>
       <w:pPr>
         <w:pStyle w:val="Literaturverzeichnis"/>
@@ -9933,7 +9974,7 @@
       <w:r>
         <w:t xml:space="preserve"> </w:t>
       </w:r>
-      <w:hyperlink r:id="rId190">
+      <w:hyperlink r:id="rId192">
         <w:r>
           <w:rPr>
             <w:rStyle w:val="Hyperlink"/>
@@ -9974,8 +10015,8 @@
         <w:t xml:space="preserve">, 455–476 (2016).</w:t>
       </w:r>
     </w:p>
-    <w:bookmarkEnd w:id="191"/>
-    <w:bookmarkStart w:id="193" w:name="ref-paul-hus2020"/>
+    <w:bookmarkEnd w:id="193"/>
+    <w:bookmarkStart w:id="195" w:name="ref-paul-hus2020"/>
     <w:p>
       <w:pPr>
         <w:pStyle w:val="Literaturverzeichnis"/>
@@ -9995,7 +10036,7 @@
       <w:r>
         <w:t xml:space="preserve"> </w:t>
       </w:r>
-      <w:hyperlink r:id="rId192">
+      <w:hyperlink r:id="rId194">
         <w:r>
           <w:rPr>
             <w:rStyle w:val="Hyperlink"/>
@@ -10030,8 +10071,8 @@
         <w:t xml:space="preserve">, 582–598 (2020).</w:t>
       </w:r>
     </w:p>
-    <w:bookmarkEnd w:id="193"/>
-    <w:bookmarkStart w:id="195" w:name="ref-sharma2021"/>
+    <w:bookmarkEnd w:id="195"/>
+    <w:bookmarkStart w:id="197" w:name="ref-sharma2021"/>
     <w:p>
       <w:pPr>
         <w:pStyle w:val="Literaturverzeichnis"/>
@@ -10051,7 +10092,7 @@
       <w:r>
         <w:t xml:space="preserve"> </w:t>
       </w:r>
-      <w:hyperlink r:id="rId194">
+      <w:hyperlink r:id="rId196">
         <w:r>
           <w:rPr>
             <w:rStyle w:val="Hyperlink"/>
@@ -10086,8 +10127,8 @@
         <w:t xml:space="preserve">, 8363–8374 (2021).</w:t>
       </w:r>
     </w:p>
-    <w:bookmarkEnd w:id="195"/>
-    <w:bookmarkStart w:id="197" w:name="ref-ni2021"/>
+    <w:bookmarkEnd w:id="197"/>
+    <w:bookmarkStart w:id="199" w:name="ref-ni2021"/>
     <w:p>
       <w:pPr>
         <w:pStyle w:val="Literaturverzeichnis"/>
@@ -10107,7 +10148,7 @@
       <w:r>
         <w:t xml:space="preserve"> </w:t>
       </w:r>
-      <w:hyperlink r:id="rId196">
+      <w:hyperlink r:id="rId198">
         <w:r>
           <w:rPr>
             <w:rStyle w:val="Hyperlink"/>
@@ -10142,8 +10183,8 @@
         <w:t xml:space="preserve">, eabe4639 (2021).</w:t>
       </w:r>
     </w:p>
-    <w:bookmarkEnd w:id="197"/>
-    <w:bookmarkStart w:id="199" w:name="ref-mirin2021"/>
+    <w:bookmarkEnd w:id="199"/>
+    <w:bookmarkStart w:id="201" w:name="ref-mirin2021"/>
     <w:p>
       <w:pPr>
         <w:pStyle w:val="Literaturverzeichnis"/>
@@ -10163,7 +10204,7 @@
       <w:r>
         <w:t xml:space="preserve"> </w:t>
       </w:r>
-      <w:hyperlink r:id="rId198">
+      <w:hyperlink r:id="rId200">
         <w:r>
           <w:rPr>
             <w:rStyle w:val="Hyperlink"/>
@@ -10198,8 +10239,8 @@
         <w:t xml:space="preserve">, 956–963 (2021).</w:t>
       </w:r>
     </w:p>
-    <w:bookmarkEnd w:id="199"/>
-    <w:bookmarkStart w:id="201" w:name="ref-leimu2005"/>
+    <w:bookmarkEnd w:id="201"/>
+    <w:bookmarkStart w:id="203" w:name="ref-leimu2005"/>
     <w:p>
       <w:pPr>
         <w:pStyle w:val="Literaturverzeichnis"/>
@@ -10219,7 +10260,7 @@
       <w:r>
         <w:t xml:space="preserve"> </w:t>
       </w:r>
-      <w:hyperlink r:id="rId200">
+      <w:hyperlink r:id="rId202">
         <w:r>
           <w:rPr>
             <w:rStyle w:val="Hyperlink"/>
@@ -10251,15 +10292,15 @@
         <w:t xml:space="preserve">, 28–32 (2005).</w:t>
       </w:r>
     </w:p>
-    <w:bookmarkEnd w:id="201"/>
-    <w:bookmarkEnd w:id="202"/>
+    <w:bookmarkEnd w:id="203"/>
+    <w:bookmarkEnd w:id="204"/>
     <w:p>
       <w:r>
         <w:br w:type="page"/>
       </w:r>
     </w:p>
-    <w:bookmarkEnd w:id="203"/>
-    <w:bookmarkStart w:id="215" w:name="appendix-appendix"/>
+    <w:bookmarkEnd w:id="205"/>
+    <w:bookmarkStart w:id="217" w:name="appendix-appendix"/>
     <w:p>
       <w:pPr>
         <w:pStyle w:val="berschrift1"/>
@@ -10268,7 +10309,7 @@
         <w:t xml:space="preserve">(APPENDIX) Appendix</w:t>
       </w:r>
     </w:p>
-    <w:bookmarkStart w:id="214" w:name="appendix-a"/>
+    <w:bookmarkStart w:id="216" w:name="appendix-a"/>
     <w:p>
       <w:pPr>
         <w:pStyle w:val="berschrift2"/>
@@ -10277,7 +10318,7 @@
         <w:t xml:space="preserve">Appendix A</w:t>
       </w:r>
     </w:p>
-    <w:bookmarkStart w:id="207" w:name="data-screening-1"/>
+    <w:bookmarkStart w:id="209" w:name="data-screening-1"/>
     <w:p>
       <w:pPr>
         <w:pStyle w:val="berschrift3"/>
@@ -10484,18 +10525,18 @@
           <wp:inline>
             <wp:extent cx="4914900" cy="3149600"/>
             <wp:effectExtent b="0" l="0" r="0" t="0"/>
-            <wp:docPr descr="" title="" id="205" name="Picture"/>
+            <wp:docPr descr="" title="" id="207" name="Picture"/>
             <a:graphic>
               <a:graphicData uri="http://schemas.openxmlformats.org/drawingml/2006/picture">
                 <pic:pic>
                   <pic:nvPicPr>
-                    <pic:cNvPr descr="figures/datascreening.jpg" id="206" name="Picture"/>
+                    <pic:cNvPr descr="figures/datascreening.jpg" id="208" name="Picture"/>
                     <pic:cNvPicPr>
                       <a:picLocks noChangeArrowheads="1" noChangeAspect="1"/>
                     </pic:cNvPicPr>
                   </pic:nvPicPr>
                   <pic:blipFill>
-                    <a:blip r:embed="rId204"/>
+                    <a:blip r:embed="rId206"/>
                     <a:stretch>
                       <a:fillRect/>
                     </a:stretch>
@@ -10522,8 +10563,8 @@
         </w:drawing>
       </w:r>
     </w:p>
-    <w:bookmarkEnd w:id="207"/>
-    <w:bookmarkStart w:id="209" w:name="research-question-1a"/>
+    <w:bookmarkEnd w:id="209"/>
+    <w:bookmarkStart w:id="211" w:name="research-question-1a"/>
     <w:p>
       <w:pPr>
         <w:pStyle w:val="berschrift3"/>
@@ -10536,8 +10577,8 @@
       <w:pPr>
         <w:pStyle w:val="TableCaption"/>
       </w:pPr>
-      <w:bookmarkStart w:id="208" w:name="tab:tab-rq1a"/>
-      <w:bookmarkEnd w:id="208"/>
+      <w:bookmarkStart w:id="210" w:name="tab:tab-rq1a"/>
+      <w:bookmarkEnd w:id="210"/>
       <w:r>
         <w:t xml:space="preserve">Table 1</w:t>
       </w:r>
@@ -11361,8 +11402,8 @@
         </w:tc>
       </w:tr>
     </w:tbl>
-    <w:bookmarkEnd w:id="209"/>
-    <w:bookmarkStart w:id="211" w:name="research-question-1b"/>
+    <w:bookmarkEnd w:id="211"/>
+    <w:bookmarkStart w:id="213" w:name="research-question-1b"/>
     <w:p>
       <w:pPr>
         <w:pStyle w:val="berschrift3"/>
@@ -11375,8 +11416,8 @@
       <w:pPr>
         <w:pStyle w:val="TableCaption"/>
       </w:pPr>
-      <w:bookmarkStart w:id="210" w:name="tab:tab-rq1b"/>
-      <w:bookmarkEnd w:id="210"/>
+      <w:bookmarkStart w:id="212" w:name="tab:tab-rq1b"/>
+      <w:bookmarkEnd w:id="212"/>
       <w:r>
         <w:t xml:space="preserve">Table 2</w:t>
       </w:r>
@@ -12945,8 +12986,8 @@
         </w:tc>
       </w:tr>
     </w:tbl>
-    <w:bookmarkEnd w:id="211"/>
-    <w:bookmarkStart w:id="213" w:name="research-question-2"/>
+    <w:bookmarkEnd w:id="213"/>
+    <w:bookmarkStart w:id="215" w:name="research-question-2"/>
     <w:p>
       <w:pPr>
         <w:pStyle w:val="berschrift3"/>
@@ -12959,8 +13000,8 @@
       <w:pPr>
         <w:pStyle w:val="TableCaption"/>
       </w:pPr>
-      <w:bookmarkStart w:id="212" w:name="tab:tab-rq2"/>
-      <w:bookmarkEnd w:id="212"/>
+      <w:bookmarkStart w:id="214" w:name="tab:tab-rq2"/>
+      <w:bookmarkEnd w:id="214"/>
       <w:r>
         <w:t xml:space="preserve">Table 3</w:t>
       </w:r>
@@ -26398,9 +26439,9 @@
         </w:tc>
       </w:tr>
     </w:tbl>
-    <w:bookmarkEnd w:id="213"/>
-    <w:bookmarkEnd w:id="214"/>
     <w:bookmarkEnd w:id="215"/>
+    <w:bookmarkEnd w:id="216"/>
+    <w:bookmarkEnd w:id="217"/>
     <w:sectPr>
       <w:headerReference r:id="rId9" w:type="even"/>
       <w:headerReference r:id="rId11" w:type="default"/>
@@ -26432,6 +26473,37 @@
     <w:p>
       <w:r>
         <w:separator/>
+      </w:r>
+    </w:p>
+  </w:footnote>
+  <w:footnote w:id="26">
+    <w:p>
+      <w:pPr>
+        <w:pStyle w:val="Funotentext"/>
+      </w:pPr>
+      <w:r>
+        <w:rPr>
+          <w:rStyle w:val="Funotenzeichen"/>
+        </w:rPr>
+        <w:footnoteRef/>
+      </w:r>
+      <w:r>
+        <w:t xml:space="preserve"> </w:t>
+      </w:r>
+      <w:r>
+        <w:t xml:space="preserve">We originally planned on using the 27 subfields within the ASJC.</w:t>
+      </w:r>
+      <w:r>
+        <w:t xml:space="preserve"> </w:t>
+      </w:r>
+      <w:r>
+        <w:t xml:space="preserve">However, we updated our preregistration to use only five of the</w:t>
+      </w:r>
+      <w:r>
+        <w:t xml:space="preserve"> </w:t>
+      </w:r>
+      <w:r>
+        <w:t xml:space="preserve">larger subfields due to computational constraints.</w:t>
       </w:r>
     </w:p>
   </w:footnote>

</xml_diff>